<commit_message>
Actualizacion de informes y creacion de testing faltante
</commit_message>
<xml_diff>
--- a/Documentacion/InformeTesting_Perlitas_de_Eucarion.docx
+++ b/Documentacion/InformeTesting_Perlitas_de_Eucarion.docx
@@ -13,7 +13,7 @@
         <w:rPr>
           <w:color w:val="auto"/>
         </w:rPr>
-        <w:t>Informe de Cobertura de Testing</w:t>
+        <w:t xml:space="preserve">Informe de Cobertura de Testing</w:t>
       </w:r>
     </w:p>
     <w:p>
@@ -29,8 +29,6 @@
       </w:r>
       <w:r>
         <w:t xml:space="preserve"> Perlitas de Eucarión – Frontend (React + Bootstrap)</w:t>
-      </w:r>
-      <w:r>
         <w:br/>
       </w:r>
       <w:r>
@@ -42,8 +40,6 @@
       </w:r>
       <w:r>
         <w:t xml:space="preserve"> DSY1104 – Desarrollo Fullstack II · Evaluación Parcial N° 2</w:t>
-      </w:r>
-      <w:r>
         <w:br/>
       </w:r>
       <w:r>
@@ -54,22 +50,7 @@
         <w:t>Integrantes:</w:t>
       </w:r>
       <w:r>
-        <w:t xml:space="preserve"> </w:t>
-      </w:r>
-      <w:r>
-        <w:t xml:space="preserve">Yuliana </w:t>
-      </w:r>
-      <w:r>
-        <w:t>Calvucura</w:t>
-      </w:r>
-      <w:r>
-        <w:t xml:space="preserve"> - Francisco Riveros - Catalina</w:t>
-      </w:r>
-      <w:r>
-        <w:t xml:space="preserve"> Salina</w:t>
-      </w:r>
-      <w:r>
-        <w:t>s</w:t>
+        <w:t xml:space="preserve"> Yuliana Calvucura - Francisco Riveros - Catalina Salinas</w:t>
       </w:r>
     </w:p>
     <w:p>
@@ -92,7 +73,7 @@
         <w:pStyle w:val="FirstParagraph"/>
       </w:pPr>
       <w:r>
-        <w:t>Este documento valida el alcance de los elementos cubiertos por las pruebas unitarias del frontend de la tienda online Perlitas de Eucarión, migrado desde HTML/CSS/JavaScript a React con Bootstrap. Las pruebas se escribieron con Jasmine y se ejecutan con Karma, y su objetivo es verificar la lógica y el comportamiento de los componentes, incluida la manipulación del DOM, para asegurar la calidad del código.</w:t>
+        <w:t xml:space="preserve">Este documento valida el alcance de los elementos cubiertos por las pruebas unitarias del frontend de la tienda online Perlitas de Eucarión, migrado desde HTML/CSS/JavaScript a React con Bootstrap. Las pruebas se escribieron con Jasmine y se ejecutan con Karma, y su objetivo es verificar la lógica y el comportamiento de los componentes, incluida la manipulación del DOM, para asegurar la calidad del código.</w:t>
       </w:r>
     </w:p>
     <w:p>
@@ -100,7 +81,7 @@
         <w:pStyle w:val="Textoindependiente"/>
       </w:pPr>
       <w:r>
-        <w:t>El informe describe la configuración del entorno, la escritura de las pruebas, el uso de mocks, el análisis de resultados y la cobertura de código obtenida.</w:t>
+        <w:t xml:space="preserve">El informe describe la configuración del entorno, la escritura de las pruebas, el uso de mocks, el análisis de resultados y la cobertura de código obtenida.</w:t>
       </w:r>
     </w:p>
     <w:p>
@@ -555,7 +536,7 @@
               <w:rPr>
                 <w:sz w:val="19"/>
               </w:rPr>
-              <w:t>, preset-env, preset-react)</w:t>
+              <w:t xml:space="preserve">, preset-env, preset-react)</w:t>
             </w:r>
           </w:p>
         </w:tc>
@@ -587,7 +568,7 @@
               <w:rPr>
                 <w:sz w:val="19"/>
               </w:rPr>
-              <w:t>Transpila JSX y JavaScript moderno</w:t>
+              <w:t xml:space="preserve">Transpila JSX y JavaScript moderno</w:t>
             </w:r>
           </w:p>
         </w:tc>
@@ -669,7 +650,7 @@
               <w:rPr>
                 <w:sz w:val="19"/>
               </w:rPr>
-              <w:t>React Testing Library (</w:t>
+              <w:t xml:space="preserve">React Testing Library (</w:t>
             </w:r>
             <w:r>
               <w:rPr>
@@ -772,7 +753,7 @@
                 <w:rStyle w:val="VerbatimChar"/>
                 <w:sz w:val="19"/>
               </w:rPr>
-              <w:t>npm run test:jsdom</w:t>
+              <w:t xml:space="preserve">npm run test:jsdom</w:t>
             </w:r>
             <w:r>
               <w:rPr>
@@ -1054,10 +1035,10 @@
         <w:rPr>
           <w:rStyle w:val="VerbatimChar"/>
         </w:rPr>
-        <w:t>npm test</w:t>
-      </w:r>
-      <w:r>
-        <w:t>: ejecuta Karma + Jasmine en ChromeHeadless y genera la cobertura.</w:t>
+        <w:t xml:space="preserve">npm test</w:t>
+      </w:r>
+      <w:r>
+        <w:t xml:space="preserve">: ejecuta Karma + Jasmine en ChromeHeadless y genera la cobertura.</w:t>
       </w:r>
     </w:p>
     <w:p>
@@ -1072,7 +1053,7 @@
         <w:rPr>
           <w:rStyle w:val="VerbatimChar"/>
         </w:rPr>
-        <w:t>npm run test:jsdom</w:t>
+        <w:t xml:space="preserve">npm run test:jsdom</w:t>
       </w:r>
       <w:r>
         <w:t>: alternativa sin Chrome.</w:t>
@@ -1090,7 +1071,7 @@
         <w:rPr>
           <w:rStyle w:val="VerbatimChar"/>
         </w:rPr>
-        <w:t>npm run test:watch</w:t>
+        <w:t xml:space="preserve">npm run test:watch</w:t>
       </w:r>
       <w:r>
         <w:t>: modo observador durante el desarrollo.</w:t>
@@ -1145,7 +1126,7 @@
           <w:b/>
           <w:bCs/>
         </w:rPr>
-        <w:t>Estructura Arrange–Act–Assert:</w:t>
+        <w:t xml:space="preserve">Estructura Arrange–Act–Assert:</w:t>
       </w:r>
       <w:r>
         <w:t xml:space="preserve"> se prepara el escenario, se ejecuta la acción (clic, cambio de input, llamada a función) y se verifica el resultado con </w:t>
@@ -1182,7 +1163,7 @@
         <w:rPr>
           <w:rStyle w:val="VerbatimChar"/>
         </w:rPr>
-        <w:t>beforeEach(() =&gt; localStorage.clear())</w:t>
+        <w:t xml:space="preserve">beforeEach(() =&gt; localStorage.clear())</w:t>
       </w:r>
       <w:r>
         <w:t xml:space="preserve"> y </w:t>
@@ -1191,7 +1172,7 @@
         <w:rPr>
           <w:rStyle w:val="VerbatimChar"/>
         </w:rPr>
-        <w:t>afterEach(() =&gt; cleanup())</w:t>
+        <w:t xml:space="preserve">afterEach(() =&gt; cleanup())</w:t>
       </w:r>
       <w:r>
         <w:t xml:space="preserve"> evitan que el estado de una prueba afecte a la siguiente.</w:t>
@@ -1210,7 +1191,7 @@
           <w:b/>
           <w:bCs/>
         </w:rPr>
-        <w:t>Mocks y spies:</w:t>
+        <w:t xml:space="preserve">Mocks y spies:</w:t>
       </w:r>
       <w:r>
         <w:t xml:space="preserve"> se reemplazan dependencias externas (red) por datos controlados, como se detalla en la sección 5.</w:t>
@@ -1307,12 +1288,11 @@
       <w:r>
         <w:rPr>
           <w:b/>
-          <w:bCs/>
-        </w:rPr>
-        <w:t>24 pruebas unitarias</w:t>
-      </w:r>
-      <w:r>
-        <w:t xml:space="preserve"> repartidas en 6 archivos de especificación, que superan el mínimo de 10 pruebas solicitado en la rúbrica.</w:t>
+        </w:rPr>
+        <w:t xml:space="preserve">52 pruebas unitarias</w:t>
+      </w:r>
+      <w:r>
+        <w:t xml:space="preserve"> repartidas en 9 archivos de especificación, que superan el mínimo de 10 pruebas solicitado en la rúbrica.</w:t>
       </w:r>
     </w:p>
     <w:tbl>
@@ -1371,7 +1351,7 @@
               <w:rPr>
                 <w:sz w:val="19"/>
               </w:rPr>
-              <w:t>N° pruebas</w:t>
+              <w:t xml:space="preserve">N° pruebas</w:t>
             </w:r>
           </w:p>
         </w:tc>
@@ -1613,7 +1593,7 @@
               <w:rPr>
                 <w:sz w:val="19"/>
               </w:rPr>
-              <w:t>5</w:t>
+              <w:t>8</w:t>
             </w:r>
           </w:p>
         </w:tc>
@@ -1637,6 +1617,51 @@
                 <w:sz w:val="19"/>
               </w:rPr>
               <w:t>localStorage</w:t>
+            </w:r>
+            <w:r>
+              <w:rPr>
+                <w:sz w:val="19"/>
+              </w:rPr>
+              <w:t xml:space="preserve">, </w:t>
+            </w:r>
+            <w:r>
+              <w:rPr>
+                <w:rStyle w:val="VerbatimChar"/>
+                <w:sz w:val="19"/>
+              </w:rPr>
+              <w:t>quitar</w:t>
+            </w:r>
+            <w:r>
+              <w:rPr>
+                <w:sz w:val="19"/>
+              </w:rPr>
+              <w:t xml:space="preserve"> un producto, tope de stock en </w:t>
+            </w:r>
+            <w:r>
+              <w:rPr>
+                <w:rStyle w:val="VerbatimChar"/>
+                <w:sz w:val="19"/>
+              </w:rPr>
+              <w:t>cambiarCantidad</w:t>
+            </w:r>
+            <w:r>
+              <w:rPr>
+                <w:sz w:val="19"/>
+              </w:rPr>
+              <w:t xml:space="preserve"> y carrito vacío si </w:t>
+            </w:r>
+            <w:r>
+              <w:rPr>
+                <w:rStyle w:val="VerbatimChar"/>
+                <w:sz w:val="19"/>
+              </w:rPr>
+              <w:t>localStorage</w:t>
+            </w:r>
+            <w:r>
+              <w:rPr>
+                <w:sz w:val="19"/>
+              </w:rPr>
+              <w:t xml:space="preserve"> contiene un JSON dañado</w:t>
             </w:r>
           </w:p>
         </w:tc>
@@ -1655,7 +1680,7 @@
                 <w:rStyle w:val="VerbatimChar"/>
                 <w:sz w:val="19"/>
               </w:rPr>
-              <w:t>ProductCard.spec.jsx</w:t>
+              <w:t>ProductosContext.spec.jsx</w:t>
             </w:r>
           </w:p>
         </w:tc>
@@ -1672,7 +1697,7 @@
               <w:rPr>
                 <w:sz w:val="19"/>
               </w:rPr>
-              <w:t>3</w:t>
+              <w:t>14</w:t>
             </w:r>
           </w:p>
         </w:tc>
@@ -1688,7 +1713,85 @@
               <w:rPr>
                 <w:sz w:val="19"/>
               </w:rPr>
-              <w:t>Props y estado del componente: muestra nombre, categoría y stock recibidos por props, no muestra error al inicio y muestra alerta al superar el stock (cambio de estado y DOM)</w:t>
+              <w:t xml:space="preserve">CRUD del catálogo: carga y error de carga, </w:t>
+            </w:r>
+            <w:r>
+              <w:rPr>
+                <w:rStyle w:val="VerbatimChar"/>
+                <w:sz w:val="19"/>
+              </w:rPr>
+              <w:t>buscarProducto</w:t>
+            </w:r>
+            <w:r>
+              <w:rPr>
+                <w:sz w:val="19"/>
+              </w:rPr>
+              <w:t xml:space="preserve">, </w:t>
+            </w:r>
+            <w:r>
+              <w:rPr>
+                <w:rStyle w:val="VerbatimChar"/>
+                <w:sz w:val="19"/>
+              </w:rPr>
+              <w:t>agregarProducto</w:t>
+            </w:r>
+            <w:r>
+              <w:rPr>
+                <w:sz w:val="19"/>
+              </w:rPr>
+              <w:t xml:space="preserve">, </w:t>
+            </w:r>
+            <w:r>
+              <w:rPr>
+                <w:rStyle w:val="VerbatimChar"/>
+                <w:sz w:val="19"/>
+              </w:rPr>
+              <w:t>editarProducto</w:t>
+            </w:r>
+            <w:r>
+              <w:rPr>
+                <w:sz w:val="19"/>
+              </w:rPr>
+              <w:t xml:space="preserve"> (con y sin descuento, id inexistente), </w:t>
+            </w:r>
+            <w:r>
+              <w:rPr>
+                <w:rStyle w:val="VerbatimChar"/>
+                <w:sz w:val="19"/>
+              </w:rPr>
+              <w:t>eliminarProducto</w:t>
+            </w:r>
+            <w:r>
+              <w:rPr>
+                <w:sz w:val="19"/>
+              </w:rPr>
+              <w:t xml:space="preserve"> (producto base, doble eliminación y producto registrado), </w:t>
+            </w:r>
+            <w:r>
+              <w:rPr>
+                <w:rStyle w:val="VerbatimChar"/>
+                <w:sz w:val="19"/>
+              </w:rPr>
+              <w:t>descontarStock</w:t>
+            </w:r>
+            <w:r>
+              <w:rPr>
+                <w:sz w:val="19"/>
+              </w:rPr>
+              <w:t xml:space="preserve"> (éxito, stock insuficiente y producto inexistente) y </w:t>
+            </w:r>
+            <w:r>
+              <w:rPr>
+                <w:rStyle w:val="VerbatimChar"/>
+                <w:sz w:val="19"/>
+              </w:rPr>
+              <w:t>localStorage</w:t>
+            </w:r>
+            <w:r>
+              <w:rPr>
+                <w:sz w:val="19"/>
+              </w:rPr>
+              <w:t xml:space="preserve"> dañado</w:t>
             </w:r>
           </w:p>
         </w:tc>
@@ -1707,7 +1810,7 @@
                 <w:rStyle w:val="VerbatimChar"/>
                 <w:sz w:val="19"/>
               </w:rPr>
-              <w:t>Productos.spec.jsx</w:t>
+              <w:t>ProductCard.spec.jsx</w:t>
             </w:r>
           </w:p>
         </w:tc>
@@ -1724,7 +1827,7 @@
               <w:rPr>
                 <w:sz w:val="19"/>
               </w:rPr>
-              <w:t>3</w:t>
+              <w:t>5</w:t>
             </w:r>
           </w:p>
         </w:tc>
@@ -1740,7 +1843,7 @@
               <w:rPr>
                 <w:sz w:val="19"/>
               </w:rPr>
-              <w:t>Página de catálogo: estado “Cargando” y luego productos, filtro por categoría al hacer clic y mensaje de error cuando falla la carga (HTTP 500)</w:t>
+              <w:t xml:space="preserve">Props y estado del componente: muestra nombre, categoría y stock recibidos por props, no muestra error al inicio, muestra alerta al superar el stock (cambio de estado y DOM) y muestra la franja de descuento solo cuando el producto está en oferta</w:t>
             </w:r>
           </w:p>
         </w:tc>
@@ -1759,7 +1862,7 @@
                 <w:rStyle w:val="VerbatimChar"/>
                 <w:sz w:val="19"/>
               </w:rPr>
-              <w:t>RegistrarProducto.spec.jsx</w:t>
+              <w:t>Productos.spec.jsx</w:t>
             </w:r>
           </w:p>
         </w:tc>
@@ -1792,7 +1895,7 @@
               <w:rPr>
                 <w:sz w:val="19"/>
               </w:rPr>
-              <w:t>Formulario: errores de validación al enviar vacío, registro correcto con limpieza del formulario y persistencia, y aparición del producto registrado en el catálogo</w:t>
+              <w:t>Página de catálogo: estado “Cargando” y luego productos, filtro por categoría al hacer clic y mensaje de error cuando falla la carga (HTTP 500)</w:t>
             </w:r>
           </w:p>
         </w:tc>
@@ -1808,6 +1911,163 @@
             </w:pPr>
             <w:r>
               <w:rPr>
+                <w:rStyle w:val="VerbatimChar"/>
+                <w:sz w:val="19"/>
+              </w:rPr>
+              <w:lastRenderedPageBreak/>
+              <w:t>RegistrarProducto.spec.jsx</w:t>
+            </w:r>
+          </w:p>
+        </w:tc>
+        <w:tc>
+          <w:tcPr>
+            <w:tcW w:w="1020" w:type="dxa"/>
+          </w:tcPr>
+          <w:p>
+            <w:pPr>
+              <w:pStyle w:val="Compact"/>
+              <w:jc w:val="center"/>
+            </w:pPr>
+            <w:r>
+              <w:rPr>
+                <w:sz w:val="19"/>
+              </w:rPr>
+              <w:t>3</w:t>
+            </w:r>
+          </w:p>
+        </w:tc>
+        <w:tc>
+          <w:tcPr>
+            <w:tcW w:w="5556" w:type="dxa"/>
+          </w:tcPr>
+          <w:p>
+            <w:pPr>
+              <w:pStyle w:val="Compact"/>
+            </w:pPr>
+            <w:r>
+              <w:rPr>
+                <w:sz w:val="19"/>
+              </w:rPr>
+              <w:t>Formulario: errores de validación al enviar vacío, registro correcto con limpieza del formulario y persistencia, y aparición del producto registrado en el catálogo</w:t>
+            </w:r>
+          </w:p>
+        </w:tc>
+      </w:tr>
+      <w:tr>
+        <w:tc>
+          <w:tcPr>
+            <w:tcW w:w="2835" w:type="dxa"/>
+          </w:tcPr>
+          <w:p>
+            <w:pPr>
+              <w:pStyle w:val="Compact"/>
+            </w:pPr>
+            <w:r>
+              <w:rPr>
+                <w:rStyle w:val="VerbatimChar"/>
+                <w:sz w:val="19"/>
+              </w:rPr>
+              <w:t>Checkout.spec.jsx</w:t>
+            </w:r>
+          </w:p>
+        </w:tc>
+        <w:tc>
+          <w:tcPr>
+            <w:tcW w:w="1020" w:type="dxa"/>
+          </w:tcPr>
+          <w:p>
+            <w:pPr>
+              <w:pStyle w:val="Compact"/>
+              <w:jc w:val="center"/>
+            </w:pPr>
+            <w:r>
+              <w:rPr>
+                <w:sz w:val="19"/>
+              </w:rPr>
+              <w:t>5</w:t>
+            </w:r>
+          </w:p>
+        </w:tc>
+        <w:tc>
+          <w:tcPr>
+            <w:tcW w:w="5556" w:type="dxa"/>
+          </w:tcPr>
+          <w:p>
+            <w:pPr>
+              <w:pStyle w:val="Compact"/>
+            </w:pPr>
+            <w:r>
+              <w:rPr>
+                <w:sz w:val="19"/>
+              </w:rPr>
+              <w:t>Página de pago: carrito vacío, resumen y total a pagar, filtro de comunas según la región, compra exitosa (vacía el carrito) y compra con error por stock insuficiente (conserva el carrito)</w:t>
+            </w:r>
+          </w:p>
+        </w:tc>
+      </w:tr>
+      <w:tr>
+        <w:tc>
+          <w:tcPr>
+            <w:tcW w:w="2835" w:type="dxa"/>
+          </w:tcPr>
+          <w:p>
+            <w:pPr>
+              <w:pStyle w:val="Compact"/>
+            </w:pPr>
+            <w:r>
+              <w:rPr>
+                <w:rStyle w:val="VerbatimChar"/>
+                <w:sz w:val="19"/>
+              </w:rPr>
+              <w:t>OrdenesContext.spec.jsx</w:t>
+            </w:r>
+          </w:p>
+        </w:tc>
+        <w:tc>
+          <w:tcPr>
+            <w:tcW w:w="1020" w:type="dxa"/>
+          </w:tcPr>
+          <w:p>
+            <w:pPr>
+              <w:pStyle w:val="Compact"/>
+              <w:jc w:val="center"/>
+            </w:pPr>
+            <w:r>
+              <w:rPr>
+                <w:sz w:val="19"/>
+              </w:rPr>
+              <w:t>4</w:t>
+            </w:r>
+          </w:p>
+        </w:tc>
+        <w:tc>
+          <w:tcPr>
+            <w:tcW w:w="5556" w:type="dxa"/>
+          </w:tcPr>
+          <w:p>
+            <w:pPr>
+              <w:pStyle w:val="Compact"/>
+            </w:pPr>
+            <w:r>
+              <w:rPr>
+                <w:sz w:val="19"/>
+              </w:rPr>
+              <w:t>Lógica de órdenes: agregar una orden (id 1000, estado Pagado y persistencia en localStorage), id correlativo en la segunda orden, cambiarEstado solo sobre la orden indicada y lista vacía si localStorage contiene un JSON dañado</w:t>
+            </w:r>
+          </w:p>
+        </w:tc>
+      </w:tr>
+      <w:tr>
+        <w:tc>
+          <w:tcPr>
+            <w:tcW w:w="2835" w:type="dxa"/>
+          </w:tcPr>
+          <w:p>
+            <w:pPr>
+              <w:pStyle w:val="Compact"/>
+            </w:pPr>
+            <w:r>
+              <w:rPr>
                 <w:b/>
                 <w:bCs/>
                 <w:sz w:val="19"/>
@@ -1828,10 +2088,9 @@
             <w:r>
               <w:rPr>
                 <w:b/>
-                <w:bCs/>
-                <w:sz w:val="19"/>
-              </w:rPr>
-              <w:t>24</w:t>
+                <w:sz w:val="19"/>
+              </w:rPr>
+              <w:t>52</w:t>
             </w:r>
           </w:p>
         </w:tc>
@@ -1852,8 +2111,7 @@
         <w:pStyle w:val="Textoindependiente"/>
       </w:pPr>
       <w:r>
-        <w:lastRenderedPageBreak/>
-        <w:t>Las pruebas abarcan tres niveles: lógica pura (validaciones y servicio), lógica de estado global (contextos) y comportamiento de componentes y páginas con manipulación del DOM (props, estados, eventos, formularios y navegación).</w:t>
+        <w:t>Las pruebas abarcan tres niveles: lógica pura (validaciones y servicio), lógica de estado global (contextos, incluido el CRUD del catálogo) y comportamiento de componentes y páginas con manipulación del DOM (props, estados, eventos, formularios, flujo de compra y navegación).</w:t>
       </w:r>
     </w:p>
     <w:p>
@@ -2065,13 +2323,22 @@
         <w:t>ProductosProvider</w:t>
       </w:r>
       <w:r>
+        <w:t xml:space="preserve">, </w:t>
+      </w:r>
+      <w:r>
+        <w:rPr>
+          <w:rStyle w:val="VerbatimChar"/>
+        </w:rPr>
+        <w:t>CarritoProvider</w:t>
+      </w:r>
+      <w:r>
         <w:t xml:space="preserve"> y </w:t>
       </w:r>
       <w:r>
         <w:rPr>
           <w:rStyle w:val="VerbatimChar"/>
         </w:rPr>
-        <w:t>CarritoProvider</w:t>
+        <w:t>OrdenesProvider</w:t>
       </w:r>
       <w:r>
         <w:t>, las dependencias que necesita para funcionar.</w:t>
@@ -2120,7 +2387,7 @@
         <w:t>src/utils/validaciones.js</w:t>
       </w:r>
       <w:r>
-        <w:t>. Al ser funciones puras no requieren DOM ni mocks. Las pruebas cubren los casos límite además del caso válido:</w:t>
+        <w:t xml:space="preserve">. Al ser funciones puras no requieren DOM ni mocks. Las pruebas cubren los casos límite además del caso válido:</w:t>
       </w:r>
     </w:p>
     <w:p>
@@ -2176,6 +2443,7 @@
         <w:pStyle w:val="FirstParagraph"/>
       </w:pPr>
       <w:r>
+        <w:lastRenderedPageBreak/>
         <w:t xml:space="preserve">Para </w:t>
       </w:r>
       <w:r>
@@ -2299,7 +2567,6 @@
           <w:noProof/>
           <w:color w:val="auto"/>
         </w:rPr>
-        <w:lastRenderedPageBreak/>
         <w:drawing>
           <wp:inline distT="0" distB="0" distL="0" distR="0" wp14:anchorId="5805AD9C" wp14:editId="481E8B66">
             <wp:extent cx="6188710" cy="1085850"/>
@@ -2404,7 +2671,7 @@
         <w:rPr>
           <w:color w:val="auto"/>
         </w:rPr>
-        <w:t xml:space="preserve"> (5 pruebas)</w:t>
+        <w:t xml:space="preserve"> (8 pruebas)</w:t>
       </w:r>
     </w:p>
     <w:p>
@@ -2513,7 +2780,7 @@
         <w:rPr>
           <w:rStyle w:val="VerbatimChar"/>
         </w:rPr>
-        <w:t>existente.cantidad &gt;= producto.stock</w:t>
+        <w:t xml:space="preserve">existente.cantidad &gt;= producto.stock</w:t>
       </w:r>
       <w:r>
         <w:t xml:space="preserve"> del contexto: al tercer intento de agregar un producto con </w:t>
@@ -2610,6 +2877,89 @@
     </w:p>
     <w:p>
       <w:pPr>
+        <w:pStyle w:val="FirstParagraph"/>
+      </w:pPr>
+      <w:r>
+        <w:lastRenderedPageBreak/>
+        <w:t xml:space="preserve">Además, tres pruebas cubren ramas que antes quedaban sin verificar: </w:t>
+      </w:r>
+      <w:r>
+        <w:rPr>
+          <w:rStyle w:val="VerbatimChar"/>
+        </w:rPr>
+        <w:t>quitar(id)</w:t>
+      </w:r>
+      <w:r>
+        <w:t xml:space="preserve"> elimina un producto sin afectar a los demás, </w:t>
+      </w:r>
+      <w:r>
+        <w:rPr>
+          <w:rStyle w:val="VerbatimChar"/>
+        </w:rPr>
+        <w:t>cambiarCantidad</w:t>
+      </w:r>
+      <w:r>
+        <w:t xml:space="preserve"> no supera el stock disponible y, si </w:t>
+      </w:r>
+      <w:r>
+        <w:rPr>
+          <w:rStyle w:val="VerbatimChar"/>
+        </w:rPr>
+        <w:t>localStorage.carrito</w:t>
+      </w:r>
+      <w:r>
+        <w:t xml:space="preserve"> contiene un JSON dañado, el carrito parte vacío.</w:t>
+      </w:r>
+    </w:p>
+    <w:p>
+      <w:pPr>
+        <w:pStyle w:val="SourceCode"/>
+        <w:shd w:val="clear" w:color="auto" w:fill="F3F4F6"/>
+        <w:spacing w:after="0"/>
+      </w:pPr>
+      <w:r>
+        <w:rPr>
+          <w:rStyle w:val="VerbatimChar"/>
+        </w:rPr>
+        <w:drawing>
+          <wp:inline distT="0" distB="0" distL="0" distR="0" wp14:anchorId="787F2E4B" wp14:editId="58B87EF6">
+            <wp:extent cx="6188710" cy="1080770"/>
+            <wp:effectExtent l="0" t="0" r="0" b="0"/>
+            <wp:docPr id="607796337" name="Imagen 1"/>
+            <wp:cNvGraphicFramePr>
+              <a:graphicFrameLocks xmlns:a="http://schemas.openxmlformats.org/drawingml/2006/main" noChangeAspect="1"/>
+            </wp:cNvGraphicFramePr>
+            <a:graphic xmlns:a="http://schemas.openxmlformats.org/drawingml/2006/main">
+              <a:graphicData uri="http://schemas.openxmlformats.org/drawingml/2006/picture">
+                <pic:pic xmlns:pic="http://schemas.openxmlformats.org/drawingml/2006/picture">
+                  <pic:nvPicPr>
+                    <pic:cNvPr id="607796337" name=""/>
+                    <pic:cNvPicPr/>
+                  </pic:nvPicPr>
+                  <pic:blipFill>
+                    <a:blip r:embed="rId12"/>
+                    <a:stretch>
+                      <a:fillRect/>
+                    </a:stretch>
+                  </pic:blipFill>
+                  <pic:spPr>
+                    <a:xfrm>
+                      <a:off x="0" y="0"/>
+                      <a:ext cx="6188710" cy="1080770"/>
+                    </a:xfrm>
+                    <a:prstGeom prst="rect">
+                      <a:avLst/>
+                    </a:prstGeom>
+                  </pic:spPr>
+                </pic:pic>
+              </a:graphicData>
+            </a:graphic>
+          </wp:inline>
+        </w:drawing>
+      </w:r>
+    </w:p>
+    <w:p>
+      <w:pPr>
         <w:pStyle w:val="Ttulo2"/>
         <w:rPr>
           <w:color w:val="auto"/>
@@ -2634,7 +2984,7 @@
         <w:rPr>
           <w:color w:val="auto"/>
         </w:rPr>
-        <w:t xml:space="preserve"> (3 pruebas)</w:t>
+        <w:t xml:space="preserve"> (5 pruebas)</w:t>
       </w:r>
     </w:p>
     <w:p>
@@ -2649,7 +2999,7 @@
           <w:b/>
           <w:bCs/>
         </w:rPr>
-        <w:t>props y estado</w:t>
+        <w:t xml:space="preserve">props y estado</w:t>
       </w:r>
       <w:r>
         <w:t xml:space="preserve"> de </w:t>
@@ -2691,7 +3041,6 @@
           <w:rStyle w:val="NormalTok"/>
           <w:noProof/>
         </w:rPr>
-        <w:lastRenderedPageBreak/>
         <w:drawing>
           <wp:inline distT="0" distB="0" distL="0" distR="0" wp14:anchorId="48C9D23F" wp14:editId="019393E8">
             <wp:extent cx="6188710" cy="1295400"/>
@@ -2708,7 +3057,7 @@
                     <pic:cNvPicPr/>
                   </pic:nvPicPr>
                   <pic:blipFill>
-                    <a:blip r:embed="rId12"/>
+                    <a:blip r:embed="rId13"/>
                     <a:stretch>
                       <a:fillRect/>
                     </a:stretch>
@@ -2749,6 +3098,23 @@
     </w:p>
     <w:p>
       <w:pPr>
+        <w:pStyle w:val="FirstParagraph"/>
+      </w:pPr>
+      <w:r>
+        <w:t xml:space="preserve">Se agregaron dos pruebas de renderizado condicional: la franja “23% OFF” aparece cuando </w:t>
+      </w:r>
+      <w:r>
+        <w:rPr>
+          <w:rStyle w:val="VerbatimChar"/>
+        </w:rPr>
+        <w:t xml:space="preserve">precioAntes &gt; precioAhora</w:t>
+      </w:r>
+      <w:r>
+        <w:t xml:space="preserve"> y no aparece cuando ambos precios son iguales.</w:t>
+      </w:r>
+    </w:p>
+    <w:p>
+      <w:pPr>
         <w:pStyle w:val="Ttulo2"/>
         <w:rPr>
           <w:color w:val="auto"/>
@@ -2837,7 +3203,7 @@
                     <pic:cNvPicPr/>
                   </pic:nvPicPr>
                   <pic:blipFill>
-                    <a:blip r:embed="rId13"/>
+                    <a:blip r:embed="rId14"/>
                     <a:stretch>
                       <a:fillRect/>
                     </a:stretch>
@@ -2924,6 +3290,7 @@
         <w:rPr>
           <w:noProof/>
         </w:rPr>
+        <w:lastRenderedPageBreak/>
         <w:drawing>
           <wp:inline distT="0" distB="0" distL="0" distR="0" wp14:anchorId="7D6242D5" wp14:editId="303DBE52">
             <wp:extent cx="6188710" cy="1603375"/>
@@ -2940,7 +3307,7 @@
                     <pic:cNvPicPr/>
                   </pic:nvPicPr>
                   <pic:blipFill>
-                    <a:blip r:embed="rId14"/>
+                    <a:blip r:embed="rId15"/>
                     <a:stretch>
                       <a:fillRect/>
                     </a:stretch>
@@ -3003,13 +3370,59 @@
           <w:color w:val="auto"/>
         </w:rPr>
       </w:pPr>
-      <w:bookmarkStart w:id="14" w:name="patrones-comunes"/>
-      <w:bookmarkEnd w:id="13"/>
       <w:r>
         <w:rPr>
           <w:color w:val="auto"/>
         </w:rPr>
-        <w:t>4.8 Patrones comunes</w:t>
+        <w:t xml:space="preserve">4.8 Estado global: </w:t>
+      </w:r>
+      <w:r>
+        <w:rPr>
+          <w:rStyle w:val="VerbatimChar"/>
+          <w:color w:val="auto"/>
+        </w:rPr>
+        <w:t>ProductosContext.spec.jsx</w:t>
+      </w:r>
+      <w:r>
+        <w:rPr>
+          <w:color w:val="auto"/>
+        </w:rPr>
+        <w:t xml:space="preserve"> (14 pruebas)</w:t>
+      </w:r>
+    </w:p>
+    <w:p>
+      <w:pPr>
+        <w:pStyle w:val="FirstParagraph"/>
+      </w:pPr>
+      <w:r>
+        <w:t xml:space="preserve">Verifica el CRUD del catálogo de </w:t>
+      </w:r>
+      <w:r>
+        <w:rPr>
+          <w:rStyle w:val="VerbatimChar"/>
+        </w:rPr>
+        <w:t>src/context/ProductosContext.jsx</w:t>
+      </w:r>
+      <w:r>
+        <w:t xml:space="preserve"> con </w:t>
+      </w:r>
+      <w:r>
+        <w:rPr>
+          <w:rStyle w:val="VerbatimChar"/>
+        </w:rPr>
+        <w:t>renderHook</w:t>
+      </w:r>
+      <w:r>
+        <w:t xml:space="preserve">, igual que en el carrito. Como el catálogo se carga de forma asíncrona, cada prueba monta el provider con </w:t>
+      </w:r>
+      <w:r>
+        <w:rPr>
+          <w:rStyle w:val="VerbatimChar"/>
+        </w:rPr>
+        <w:t>fetch</w:t>
+      </w:r>
+      <w:r>
+        <w:t xml:space="preserve"> mockeado y espera a que termine la carga antes de operar. Las pruebas se agrupan por operación:</w:t>
       </w:r>
     </w:p>
     <w:p>
@@ -3023,30 +3436,38 @@
       <w:r>
         <w:rPr>
           <w:b/>
-          <w:bCs/>
-        </w:rPr>
-        <w:t>Aislamiento:</w:t>
-      </w:r>
-      <w:r>
-        <w:t xml:space="preserve"> </w:t>
-      </w:r>
-      <w:r>
-        <w:rPr>
-          <w:rStyle w:val="VerbatimChar"/>
-        </w:rPr>
-        <w:t>beforeEach(() =&gt; localStorage.clear())</w:t>
-      </w:r>
-      <w:r>
-        <w:t xml:space="preserve"> y </w:t>
-      </w:r>
-      <w:r>
-        <w:rPr>
-          <w:rStyle w:val="VerbatimChar"/>
-        </w:rPr>
-        <w:t>afterEach(() =&gt; cleanup())</w:t>
-      </w:r>
-      <w:r>
-        <w:t xml:space="preserve"> evitan que el estado de una prueba afecte a la siguiente.</w:t>
+        </w:rPr>
+        <w:t xml:space="preserve">Lectura (3): </w:t>
+      </w:r>
+      <w:r>
+        <w:t xml:space="preserve">carga del catálogo, </w:t>
+      </w:r>
+      <w:r>
+        <w:rPr>
+          <w:rStyle w:val="VerbatimChar"/>
+        </w:rPr>
+        <w:t>buscarProducto</w:t>
+      </w:r>
+      <w:r>
+        <w:t xml:space="preserve"> por id numérico o texto (y </w:t>
+      </w:r>
+      <w:r>
+        <w:rPr>
+          <w:rStyle w:val="VerbatimChar"/>
+        </w:rPr>
+        <w:t>undefined</w:t>
+      </w:r>
+      <w:r>
+        <w:t xml:space="preserve"> si no existe) y error HTTP 500 expuesto en </w:t>
+      </w:r>
+      <w:r>
+        <w:rPr>
+          <w:rStyle w:val="VerbatimChar"/>
+        </w:rPr>
+        <w:t>error</w:t>
+      </w:r>
+      <w:r>
+        <w:t>.</w:t>
       </w:r>
     </w:p>
     <w:p>
@@ -3060,39 +3481,26 @@
       <w:r>
         <w:rPr>
           <w:b/>
-          <w:bCs/>
-        </w:rPr>
-        <w:t>Consultas por rol, texto y etiqueta</w:t>
-      </w:r>
-      <w:r>
-        <w:t xml:space="preserve"> (</w:t>
-      </w:r>
-      <w:r>
-        <w:rPr>
-          <w:rStyle w:val="VerbatimChar"/>
-        </w:rPr>
-        <w:t>getByRole</w:t>
-      </w:r>
-      <w:r>
-        <w:t xml:space="preserve">, </w:t>
-      </w:r>
-      <w:r>
-        <w:rPr>
-          <w:rStyle w:val="VerbatimChar"/>
-        </w:rPr>
-        <w:t>getByText</w:t>
-      </w:r>
-      <w:r>
-        <w:t xml:space="preserve">, </w:t>
-      </w:r>
-      <w:r>
-        <w:rPr>
-          <w:rStyle w:val="VerbatimChar"/>
-        </w:rPr>
-        <w:t>getByLabelText</w:t>
-      </w:r>
-      <w:r>
-        <w:t>): verifican lo que ve el usuario y no detalles internos del código.</w:t>
+        </w:rPr>
+        <w:t xml:space="preserve">Creación (1): </w:t>
+      </w:r>
+      <w:r>
+        <w:rPr>
+          <w:rStyle w:val="VerbatimChar"/>
+        </w:rPr>
+        <w:t>agregarProducto</w:t>
+      </w:r>
+      <w:r>
+        <w:t xml:space="preserve"> asigna un id correlativo, recorta espacios y guarda en </w:t>
+      </w:r>
+      <w:r>
+        <w:rPr>
+          <w:rStyle w:val="VerbatimChar"/>
+        </w:rPr>
+        <w:t>localStorage</w:t>
+      </w:r>
+      <w:r>
+        <w:t>.</w:t>
       </w:r>
     </w:p>
     <w:p>
@@ -3106,30 +3514,26 @@
       <w:r>
         <w:rPr>
           <w:b/>
-          <w:bCs/>
-        </w:rPr>
-        <w:t>Eventos simulados</w:t>
-      </w:r>
-      <w:r>
-        <w:t xml:space="preserve"> (</w:t>
-      </w:r>
-      <w:r>
-        <w:rPr>
-          <w:rStyle w:val="VerbatimChar"/>
-        </w:rPr>
-        <w:t>fireEvent.click</w:t>
-      </w:r>
-      <w:r>
-        <w:t xml:space="preserve">, </w:t>
-      </w:r>
-      <w:r>
-        <w:rPr>
-          <w:rStyle w:val="VerbatimChar"/>
-        </w:rPr>
-        <w:t>fireEvent.change</w:t>
-      </w:r>
-      <w:r>
-        <w:t>): ejercitan el comportamiento real de los componentes.</w:t>
+        </w:rPr>
+        <w:t xml:space="preserve">Actualización (3): </w:t>
+      </w:r>
+      <w:r>
+        <w:rPr>
+          <w:rStyle w:val="VerbatimChar"/>
+        </w:rPr>
+        <w:t>editarProducto</w:t>
+      </w:r>
+      <w:r>
+        <w:t xml:space="preserve"> recalcula </w:t>
+      </w:r>
+      <w:r>
+        <w:rPr>
+          <w:rStyle w:val="VerbatimChar"/>
+        </w:rPr>
+        <w:t>precioAhora</w:t>
+      </w:r>
+      <w:r>
+        <w:t xml:space="preserve"> aplicando el descuento (10000 con 20% → 8000), con descuento vacío deja el mismo precio y con un id inexistente no cambia nada.</w:t>
       </w:r>
     </w:p>
     <w:p>
@@ -3143,10 +3547,727 @@
       <w:r>
         <w:rPr>
           <w:b/>
+        </w:rPr>
+        <w:t xml:space="preserve">Eliminación (3): </w:t>
+      </w:r>
+      <w:r>
+        <w:rPr>
+          <w:rStyle w:val="VerbatimChar"/>
+        </w:rPr>
+        <w:t>eliminarProducto</w:t>
+      </w:r>
+      <w:r>
+        <w:t xml:space="preserve"> oculta un producto base y lo registra en </w:t>
+      </w:r>
+      <w:r>
+        <w:rPr>
+          <w:rStyle w:val="VerbatimChar"/>
+        </w:rPr>
+        <w:t>productosEliminados</w:t>
+      </w:r>
+      <w:r>
+        <w:t>, eliminar dos veces no duplica el registro y un producto registrado por el administrador se borra por completo.</w:t>
+      </w:r>
+    </w:p>
+    <w:p>
+      <w:pPr>
+        <w:pStyle w:val="Compact"/>
+        <w:numPr>
+          <w:ilvl w:val="0"/>
+          <w:numId w:val="6"/>
+        </w:numPr>
+      </w:pPr>
+      <w:r>
+        <w:rPr>
+          <w:b/>
+        </w:rPr>
+        <w:t xml:space="preserve">Compra (3): </w:t>
+      </w:r>
+      <w:r>
+        <w:rPr>
+          <w:rStyle w:val="VerbatimChar"/>
+        </w:rPr>
+        <w:t>descontarStock</w:t>
+      </w:r>
+      <w:r>
+        <w:t xml:space="preserve"> baja el stock y devuelve </w:t>
+      </w:r>
+      <w:r>
+        <w:rPr>
+          <w:rStyle w:val="VerbatimChar"/>
+        </w:rPr>
+        <w:t>true</w:t>
+      </w:r>
+      <w:r>
+        <w:t xml:space="preserve">; devuelve </w:t>
+      </w:r>
+      <w:r>
+        <w:rPr>
+          <w:rStyle w:val="VerbatimChar"/>
+        </w:rPr>
+        <w:t>false</w:t>
+      </w:r>
+      <w:r>
+        <w:t xml:space="preserve"> si el stock no alcanza o si el producto no existe.</w:t>
+      </w:r>
+    </w:p>
+    <w:p>
+      <w:pPr>
+        <w:pStyle w:val="Compact"/>
+        <w:numPr>
+          <w:ilvl w:val="0"/>
+          <w:numId w:val="6"/>
+        </w:numPr>
+      </w:pPr>
+      <w:r>
+        <w:rPr>
+          <w:b/>
+        </w:rPr>
+        <w:t xml:space="preserve">Datos dañados (1): </w:t>
+      </w:r>
+      <w:r>
+        <w:t xml:space="preserve">un JSON inválido en </w:t>
+      </w:r>
+      <w:r>
+        <w:rPr>
+          <w:rStyle w:val="VerbatimChar"/>
+        </w:rPr>
+        <w:t>localStorage</w:t>
+      </w:r>
+      <w:r>
+        <w:t xml:space="preserve"> se ignora y se usan valores por defecto.</w:t>
+      </w:r>
+    </w:p>
+    <w:p>
+      <w:pPr>
+        <w:pStyle w:val="FirstParagraph"/>
+      </w:pPr>
+      <w:r>
+        <w:t xml:space="preserve">Jasmine no lanza una excepción cuando falla un </w:t>
+      </w:r>
+      <w:r>
+        <w:rPr>
+          <w:rStyle w:val="VerbatimChar"/>
+        </w:rPr>
+        <w:t>expect</w:t>
+      </w:r>
+      <w:r>
+        <w:t xml:space="preserve">, por lo que esperar la carga con </w:t>
+      </w:r>
+      <w:r>
+        <w:rPr>
+          <w:rStyle w:val="VerbatimChar"/>
+        </w:rPr>
+        <w:t xml:space="preserve">waitFor(() =&gt; expect(...))</w:t>
+      </w:r>
+      <w:r>
+        <w:t xml:space="preserve"> no reintenta. Por eso se definió una función auxiliar que sí lanza un error mientras el estado </w:t>
+      </w:r>
+      <w:r>
+        <w:rPr>
+          <w:rStyle w:val="VerbatimChar"/>
+        </w:rPr>
+        <w:t>cargando</w:t>
+      </w:r>
+      <w:r>
+        <w:t xml:space="preserve"> sea verdadero:</w:t>
+      </w:r>
+    </w:p>
+    <w:p>
+      <w:pPr>
+        <w:pStyle w:val="Ttulo2"/>
+        <w:rPr>
+          <w:color w:val="auto"/>
+        </w:rPr>
+      </w:pPr>
+      <w:r>
+        <w:rPr>
+          <w:rStyle w:val="VerbatimChar"/>
+          <w:rFonts w:eastAsia="Calibri" w:cstheme="minorBidi"/>
+          <w:b w:val="0"/>
+          <w:bCs w:val="0"/>
+          <w:color w:val="auto"/>
+          <w:szCs w:val="24"/>
+        </w:rPr>
+        <w:drawing>
+          <wp:inline distT="0" distB="0" distL="0" distR="0" wp14:anchorId="071FEF32" wp14:editId="29C55AC9">
+            <wp:extent cx="6188710" cy="803910"/>
+            <wp:effectExtent l="0" t="0" r="0" b="0"/>
+            <wp:docPr id="1613044446" name="Imagen 1"/>
+            <wp:cNvGraphicFramePr>
+              <a:graphicFrameLocks xmlns:a="http://schemas.openxmlformats.org/drawingml/2006/main" noChangeAspect="1"/>
+            </wp:cNvGraphicFramePr>
+            <a:graphic xmlns:a="http://schemas.openxmlformats.org/drawingml/2006/main">
+              <a:graphicData uri="http://schemas.openxmlformats.org/drawingml/2006/picture">
+                <pic:pic xmlns:pic="http://schemas.openxmlformats.org/drawingml/2006/picture">
+                  <pic:nvPicPr>
+                    <pic:cNvPr id="1613044446" name=""/>
+                    <pic:cNvPicPr/>
+                  </pic:nvPicPr>
+                  <pic:blipFill>
+                    <a:blip r:embed="rId16"/>
+                    <a:stretch>
+                      <a:fillRect/>
+                    </a:stretch>
+                  </pic:blipFill>
+                  <pic:spPr>
+                    <a:xfrm>
+                      <a:off x="0" y="0"/>
+                      <a:ext cx="6188710" cy="803910"/>
+                    </a:xfrm>
+                    <a:prstGeom prst="rect">
+                      <a:avLst/>
+                    </a:prstGeom>
+                  </pic:spPr>
+                </pic:pic>
+              </a:graphicData>
+            </a:graphic>
+          </wp:inline>
+        </w:drawing>
+      </w:r>
+    </w:p>
+    <w:p>
+      <w:pPr>
+        <w:pStyle w:val="Ttulo2"/>
+        <w:rPr>
+          <w:color w:val="auto"/>
+        </w:rPr>
+      </w:pPr>
+      <w:r>
+        <w:rPr>
+          <w:color w:val="auto"/>
+        </w:rPr>
+        <w:t xml:space="preserve">4.9 Página: </w:t>
+      </w:r>
+      <w:r>
+        <w:rPr>
+          <w:rStyle w:val="VerbatimChar"/>
+          <w:color w:val="auto"/>
+        </w:rPr>
+        <w:t>Checkout.spec.jsx</w:t>
+      </w:r>
+      <w:r>
+        <w:rPr>
+          <w:color w:val="auto"/>
+        </w:rPr>
+        <w:t xml:space="preserve"> (5 pruebas)</w:t>
+      </w:r>
+    </w:p>
+    <w:p>
+      <w:pPr>
+        <w:pStyle w:val="FirstParagraph"/>
+      </w:pPr>
+      <w:r>
+        <w:t xml:space="preserve">Verifica el flujo de pago de </w:t>
+      </w:r>
+      <w:r>
+        <w:rPr>
+          <w:rStyle w:val="VerbatimChar"/>
+        </w:rPr>
+        <w:t>src/pages/Checkout.jsx</w:t>
+      </w:r>
+      <w:r>
+        <w:t xml:space="preserve">. La página se renderiza dentro de </w:t>
+      </w:r>
+      <w:r>
+        <w:rPr>
+          <w:rStyle w:val="VerbatimChar"/>
+        </w:rPr>
+        <w:t>Envoltorio</w:t>
+      </w:r>
+      <w:r>
+        <w:t xml:space="preserve"> con rutas simuladas (</w:t>
+      </w:r>
+      <w:r>
+        <w:rPr>
+          <w:rStyle w:val="VerbatimChar"/>
+        </w:rPr>
+        <w:t>/compra-exitosa</w:t>
+      </w:r>
+      <w:r>
+        <w:t xml:space="preserve"> y </w:t>
+      </w:r>
+      <w:r>
+        <w:rPr>
+          <w:rStyle w:val="VerbatimChar"/>
+        </w:rPr>
+        <w:t>/compra-error</w:t>
+      </w:r>
+      <w:r>
+        <w:t xml:space="preserve">) para comprobar a qué pantalla navega. El carrito se prepara en </w:t>
+      </w:r>
+      <w:r>
+        <w:rPr>
+          <w:rStyle w:val="VerbatimChar"/>
+        </w:rPr>
+        <w:t>localStorage</w:t>
+      </w:r>
+      <w:r>
+        <w:t xml:space="preserve"> y el formulario se completa con </w:t>
+      </w:r>
+      <w:r>
+        <w:rPr>
+          <w:rStyle w:val="VerbatimChar"/>
+        </w:rPr>
+        <w:t>fireEvent.change</w:t>
+      </w:r>
+      <w:r>
+        <w:t>.</w:t>
+      </w:r>
+    </w:p>
+    <w:p>
+      <w:pPr>
+        <w:pStyle w:val="Compact"/>
+        <w:numPr>
+          <w:ilvl w:val="0"/>
+          <w:numId w:val="6"/>
+        </w:numPr>
+      </w:pPr>
+      <w:r>
+        <w:rPr>
+          <w:b/>
+        </w:rPr>
+        <w:t xml:space="preserve">Carrito vacío: </w:t>
+      </w:r>
+      <w:r>
+        <w:t>muestra “No hay productos para comprar”.</w:t>
+      </w:r>
+    </w:p>
+    <w:p>
+      <w:pPr>
+        <w:pStyle w:val="Compact"/>
+        <w:numPr>
+          <w:ilvl w:val="0"/>
+          <w:numId w:val="6"/>
+        </w:numPr>
+      </w:pPr>
+      <w:r>
+        <w:rPr>
+          <w:b/>
+        </w:rPr>
+        <w:t xml:space="preserve">Resumen: </w:t>
+      </w:r>
+      <w:r>
+        <w:t>muestra los productos y el total en el botón “Pagar ahora”.</w:t>
+      </w:r>
+    </w:p>
+    <w:p>
+      <w:pPr>
+        <w:pStyle w:val="Compact"/>
+        <w:numPr>
+          <w:ilvl w:val="0"/>
+          <w:numId w:val="6"/>
+        </w:numPr>
+      </w:pPr>
+      <w:r>
+        <w:rPr>
+          <w:b/>
+        </w:rPr>
+        <w:lastRenderedPageBreak/>
+        <w:t xml:space="preserve">Comunas: </w:t>
+      </w:r>
+      <w:r>
+        <w:t>la comuna está deshabilitada hasta elegir una región y luego solo muestra las comunas de esa región.</w:t>
+      </w:r>
+    </w:p>
+    <w:p>
+      <w:pPr>
+        <w:pStyle w:val="Compact"/>
+        <w:numPr>
+          <w:ilvl w:val="0"/>
+          <w:numId w:val="6"/>
+        </w:numPr>
+      </w:pPr>
+      <w:r>
+        <w:rPr>
+          <w:b/>
+        </w:rPr>
+        <w:t xml:space="preserve">Compra exitosa: </w:t>
+      </w:r>
+      <w:r>
+        <w:t>con datos válidos y stock suficiente navega a la pantalla de éxito y vacía el carrito.</w:t>
+      </w:r>
+    </w:p>
+    <w:p>
+      <w:pPr>
+        <w:pStyle w:val="Compact"/>
+        <w:numPr>
+          <w:ilvl w:val="0"/>
+          <w:numId w:val="6"/>
+        </w:numPr>
+      </w:pPr>
+      <w:r>
+        <w:rPr>
+          <w:b/>
+        </w:rPr>
+        <w:t xml:space="preserve">Compra con error: </w:t>
+      </w:r>
+      <w:r>
+        <w:t>con una cantidad mayor al stock navega a la pantalla de error y conserva el carrito.</w:t>
+      </w:r>
+    </w:p>
+    <w:p>
+      <w:pPr>
+        <w:pStyle w:val="FirstParagraph"/>
+      </w:pPr>
+      <w:r>
+        <w:t>Ejemplo de la prueba de compra con error:</w:t>
+      </w:r>
+    </w:p>
+    <w:p>
+      <w:pPr>
+        <w:pStyle w:val="FirstParagraph"/>
+      </w:pPr>
+      <w:r>
+        <w:rPr>
+          <w:rStyle w:val="VerbatimChar"/>
+          <w:rFonts w:eastAsia="Calibri" w:cstheme="minorBidi"/>
+          <w:b w:val="0"/>
+          <w:bCs w:val="0"/>
+          <w:color w:val="auto"/>
+          <w:szCs w:val="24"/>
+        </w:rPr>
+        <w:drawing>
+          <wp:inline distT="0" distB="0" distL="0" distR="0" wp14:anchorId="4A33985D" wp14:editId="579DE415">
+            <wp:extent cx="6188710" cy="1270000"/>
+            <wp:effectExtent l="0" t="0" r="0" b="0"/>
+            <wp:docPr id="527002858" name="Imagen 1"/>
+            <wp:cNvGraphicFramePr>
+              <a:graphicFrameLocks xmlns:a="http://schemas.openxmlformats.org/drawingml/2006/main" noChangeAspect="1"/>
+            </wp:cNvGraphicFramePr>
+            <a:graphic xmlns:a="http://schemas.openxmlformats.org/drawingml/2006/main">
+              <a:graphicData uri="http://schemas.openxmlformats.org/drawingml/2006/picture">
+                <pic:pic xmlns:pic="http://schemas.openxmlformats.org/drawingml/2006/picture">
+                  <pic:nvPicPr>
+                    <pic:cNvPr id="527002858" name=""/>
+                    <pic:cNvPicPr/>
+                  </pic:nvPicPr>
+                  <pic:blipFill>
+                    <a:blip r:embed="rId17"/>
+                    <a:stretch>
+                      <a:fillRect/>
+                    </a:stretch>
+                  </pic:blipFill>
+                  <pic:spPr>
+                    <a:xfrm>
+                      <a:off x="0" y="0"/>
+                      <a:ext cx="6188710" cy="1270000"/>
+                    </a:xfrm>
+                    <a:prstGeom prst="rect">
+                      <a:avLst/>
+                    </a:prstGeom>
+                  </pic:spPr>
+                </pic:pic>
+              </a:graphicData>
+            </a:graphic>
+          </wp:inline>
+        </w:drawing>
+      </w:r>
+    </w:p>
+    <w:p>
+      <w:pPr>
+        <w:pStyle w:val="Ttulo2"/>
+        <w:rPr>
+          <w:color w:val="auto"/>
+        </w:rPr>
+      </w:pPr>
+      <w:r>
+        <w:rPr>
+          <w:color w:val="auto"/>
+        </w:rPr>
+        <w:t>4.10 Estado global: OrdenesContext.spec.jsx (4 pruebas)</w:t>
+      </w:r>
+    </w:p>
+    <w:p>
+      <w:pPr>
+        <w:pStyle w:val="FirstParagraph"/>
+      </w:pPr>
+      <w:r>
+        <w:t xml:space="preserve">Verifica las órdenes de compra de </w:t>
+      </w:r>
+      <w:r>
+        <w:rPr>
+          <w:rStyle w:val="VerbatimChar"/>
+        </w:rPr>
+        <w:t xml:space="preserve">src/context/OrdenesContext.jsx</w:t>
+      </w:r>
+      <w:r>
+        <w:t xml:space="preserve"> con </w:t>
+      </w:r>
+      <w:r>
+        <w:rPr>
+          <w:rStyle w:val="VerbatimChar"/>
+        </w:rPr>
+        <w:t xml:space="preserve">renderHook</w:t>
+      </w:r>
+      <w:r>
+        <w:t xml:space="preserve">, igual que el carrito, usando </w:t>
+      </w:r>
+      <w:r>
+        <w:rPr>
+          <w:rStyle w:val="VerbatimChar"/>
+        </w:rPr>
+        <w:t xml:space="preserve">OrdenesProvider</w:t>
+      </w:r>
+      <w:r>
+        <w:t xml:space="preserve"> como envoltorio y limpiando </w:t>
+      </w:r>
+      <w:r>
+        <w:rPr>
+          <w:rStyle w:val="VerbatimChar"/>
+        </w:rPr>
+        <w:t xml:space="preserve">localStorage</w:t>
+      </w:r>
+      <w:r>
+        <w:t xml:space="preserve"> antes de cada prueba. Las pruebas se agregaron para cubrir las funciones y ramas que el reporte de cobertura había marcado sin ejecutar:</w:t>
+      </w:r>
+    </w:p>
+    <w:p>
+      <w:pPr>
+        <w:pStyle w:val="Compact"/>
+        <w:numPr>
+          <w:ilvl w:val="0"/>
+          <w:numId w:val="6"/>
+        </w:numPr>
+      </w:pPr>
+      <w:r>
+        <w:rPr>
+          <w:b/>
+        </w:rPr>
+        <w:t xml:space="preserve">Agregar una orden: </w:t>
+      </w:r>
+      <w:r>
+        <w:t xml:space="preserve">el primer id es 1000, el estado inicial es “Pagado” (el mismo valor que ofrece el selector del panel administrativo) y la orden queda guardada en </w:t>
+      </w:r>
+      <w:r>
+        <w:rPr>
+          <w:rStyle w:val="VerbatimChar"/>
+        </w:rPr>
+        <w:t xml:space="preserve">localStorage</w:t>
+      </w:r>
+      <w:r>
+        <w:t xml:space="preserve">.</w:t>
+      </w:r>
+    </w:p>
+    <w:p>
+      <w:pPr>
+        <w:pStyle w:val="Compact"/>
+        <w:numPr>
+          <w:ilvl w:val="0"/>
+          <w:numId w:val="6"/>
+        </w:numPr>
+      </w:pPr>
+      <w:r>
+        <w:rPr>
+          <w:b/>
+        </w:rPr>
+        <w:t xml:space="preserve">Id correlativo: </w:t>
+      </w:r>
+      <w:r>
+        <w:t xml:space="preserve">la segunda orden recibe el id 1001.</w:t>
+      </w:r>
+    </w:p>
+    <w:p>
+      <w:pPr>
+        <w:pStyle w:val="Compact"/>
+        <w:numPr>
+          <w:ilvl w:val="0"/>
+          <w:numId w:val="6"/>
+        </w:numPr>
+      </w:pPr>
+      <w:r>
+        <w:rPr>
+          <w:b/>
+        </w:rPr>
+        <w:t xml:space="preserve">Cambiar estado: </w:t>
+      </w:r>
+      <w:r>
+        <w:rPr>
+          <w:rStyle w:val="VerbatimChar"/>
+        </w:rPr>
+        <w:t xml:space="preserve">cambiarEstado</w:t>
+      </w:r>
+      <w:r>
+        <w:t xml:space="preserve"> modifica solo la orden indicada y deja las demás sin cambios.</w:t>
+      </w:r>
+    </w:p>
+    <w:p>
+      <w:pPr>
+        <w:pStyle w:val="Compact"/>
+        <w:numPr>
+          <w:ilvl w:val="0"/>
+          <w:numId w:val="6"/>
+        </w:numPr>
+      </w:pPr>
+      <w:r>
+        <w:rPr>
+          <w:b/>
+        </w:rPr>
+        <w:t xml:space="preserve">Datos dañados: </w:t>
+      </w:r>
+      <w:r>
+        <w:t xml:space="preserve">si </w:t>
+      </w:r>
+      <w:r>
+        <w:rPr>
+          <w:rStyle w:val="VerbatimChar"/>
+        </w:rPr>
+        <w:t xml:space="preserve">localStorage.ordenes</w:t>
+      </w:r>
+      <w:r>
+        <w:t xml:space="preserve"> contiene un JSON inválido, la lista de órdenes parte vacía.</w:t>
+      </w:r>
+    </w:p>
+    <w:p>
+      <w:pPr>
+        <w:pStyle w:val="Ttulo2"/>
+        <w:rPr>
+          <w:color w:val="auto"/>
+        </w:rPr>
+      </w:pPr>
+      <w:bookmarkStart w:id="14" w:name="patrones-comunes"/>
+      <w:bookmarkEnd w:id="13"/>
+      <w:r>
+        <w:rPr>
+          <w:color w:val="auto"/>
+        </w:rPr>
+        <w:t>4.11 Patrones comunes</w:t>
+      </w:r>
+    </w:p>
+    <w:p>
+      <w:pPr>
+        <w:pStyle w:val="Compact"/>
+        <w:numPr>
+          <w:ilvl w:val="0"/>
+          <w:numId w:val="6"/>
+        </w:numPr>
+      </w:pPr>
+      <w:r>
+        <w:rPr>
+          <w:b/>
           <w:bCs/>
         </w:rPr>
-        <w:lastRenderedPageBreak/>
-        <w:t>Mocks y spies:</w:t>
+        <w:t>Aislamiento:</w:t>
+      </w:r>
+      <w:r>
+        <w:t xml:space="preserve"> </w:t>
+      </w:r>
+      <w:r>
+        <w:rPr>
+          <w:rStyle w:val="VerbatimChar"/>
+        </w:rPr>
+        <w:t xml:space="preserve">beforeEach(() =&gt; localStorage.clear())</w:t>
+      </w:r>
+      <w:r>
+        <w:t xml:space="preserve"> y </w:t>
+      </w:r>
+      <w:r>
+        <w:rPr>
+          <w:rStyle w:val="VerbatimChar"/>
+        </w:rPr>
+        <w:t xml:space="preserve">afterEach(() =&gt; cleanup())</w:t>
+      </w:r>
+      <w:r>
+        <w:t xml:space="preserve"> evitan que el estado de una prueba afecte a la siguiente.</w:t>
+      </w:r>
+    </w:p>
+    <w:p>
+      <w:pPr>
+        <w:pStyle w:val="Compact"/>
+        <w:numPr>
+          <w:ilvl w:val="0"/>
+          <w:numId w:val="6"/>
+        </w:numPr>
+      </w:pPr>
+      <w:r>
+        <w:rPr>
+          <w:b/>
+          <w:bCs/>
+        </w:rPr>
+        <w:t>Consultas por rol, texto y etiqueta</w:t>
+      </w:r>
+      <w:r>
+        <w:t xml:space="preserve"> (</w:t>
+      </w:r>
+      <w:r>
+        <w:rPr>
+          <w:rStyle w:val="VerbatimChar"/>
+        </w:rPr>
+        <w:t>getByRole</w:t>
+      </w:r>
+      <w:r>
+        <w:t xml:space="preserve">, </w:t>
+      </w:r>
+      <w:r>
+        <w:rPr>
+          <w:rStyle w:val="VerbatimChar"/>
+        </w:rPr>
+        <w:t>getByText</w:t>
+      </w:r>
+      <w:r>
+        <w:t xml:space="preserve">, </w:t>
+      </w:r>
+      <w:r>
+        <w:rPr>
+          <w:rStyle w:val="VerbatimChar"/>
+        </w:rPr>
+        <w:t>getByLabelText</w:t>
+      </w:r>
+      <w:r>
+        <w:t>): verifican lo que ve el usuario y no detalles internos del código.</w:t>
+      </w:r>
+    </w:p>
+    <w:p>
+      <w:pPr>
+        <w:pStyle w:val="Compact"/>
+        <w:numPr>
+          <w:ilvl w:val="0"/>
+          <w:numId w:val="6"/>
+        </w:numPr>
+      </w:pPr>
+      <w:r>
+        <w:rPr>
+          <w:b/>
+          <w:bCs/>
+        </w:rPr>
+        <w:t>Eventos simulados</w:t>
+      </w:r>
+      <w:r>
+        <w:t xml:space="preserve"> (</w:t>
+      </w:r>
+      <w:r>
+        <w:rPr>
+          <w:rStyle w:val="VerbatimChar"/>
+        </w:rPr>
+        <w:t>fireEvent.click</w:t>
+      </w:r>
+      <w:r>
+        <w:t xml:space="preserve">, </w:t>
+      </w:r>
+      <w:r>
+        <w:rPr>
+          <w:rStyle w:val="VerbatimChar"/>
+        </w:rPr>
+        <w:t>fireEvent.change</w:t>
+      </w:r>
+      <w:r>
+        <w:t>): ejercitan el comportamiento real de los componentes.</w:t>
+      </w:r>
+    </w:p>
+    <w:p>
+      <w:pPr>
+        <w:pStyle w:val="Compact"/>
+        <w:numPr>
+          <w:ilvl w:val="0"/>
+          <w:numId w:val="6"/>
+        </w:numPr>
+      </w:pPr>
+      <w:r>
+        <w:rPr>
+          <w:b/>
+          <w:bCs/>
+        </w:rPr>
+        <w:t xml:space="preserve">Mocks y spies:</w:t>
       </w:r>
       <w:r>
         <w:t xml:space="preserve"> </w:t>
@@ -3184,7 +4305,7 @@
         <w:rPr>
           <w:color w:val="auto"/>
         </w:rPr>
-        <w:t>5. Uso de mocks</w:t>
+        <w:t xml:space="preserve">5. Uso de mocks</w:t>
       </w:r>
     </w:p>
     <w:tbl>
@@ -3448,7 +4569,7 @@
                 <w:rStyle w:val="VerbatimChar"/>
                 <w:sz w:val="19"/>
               </w:rPr>
-              <w:t>{ ok, status, json }</w:t>
+              <w:t xml:space="preserve">{ ok, status, json }</w:t>
             </w:r>
           </w:p>
         </w:tc>
@@ -3640,6 +4761,19 @@
               <w:rPr>
                 <w:sz w:val="19"/>
               </w:rPr>
+              <w:t xml:space="preserve">, </w:t>
+            </w:r>
+            <w:r>
+              <w:rPr>
+                <w:rStyle w:val="VerbatimChar"/>
+                <w:sz w:val="19"/>
+              </w:rPr>
+              <w:t>CarritoProvider</w:t>
+            </w:r>
+            <w:r>
+              <w:rPr>
+                <w:sz w:val="19"/>
+              </w:rPr>
               <w:t xml:space="preserve"> y </w:t>
             </w:r>
             <w:r>
@@ -3647,7 +4781,7 @@
                 <w:rStyle w:val="VerbatimChar"/>
                 <w:sz w:val="19"/>
               </w:rPr>
-              <w:t>CarritoProvider</w:t>
+              <w:t>OrdenesProvider</w:t>
             </w:r>
           </w:p>
         </w:tc>
@@ -3719,6 +4853,63 @@
           </w:p>
         </w:tc>
       </w:tr>
+      <w:tr>
+        <w:tc>
+          <w:tcPr>
+            <w:tcW w:w="2041" w:type="dxa"/>
+          </w:tcPr>
+          <w:p>
+            <w:pPr>
+              <w:pStyle w:val="Compact"/>
+            </w:pPr>
+            <w:r>
+              <w:rPr>
+                <w:sz w:val="19"/>
+              </w:rPr>
+              <w:t>Navegación (Checkout)</w:t>
+            </w:r>
+          </w:p>
+        </w:tc>
+        <w:tc>
+          <w:tcPr>
+            <w:tcW w:w="2608" w:type="dxa"/>
+          </w:tcPr>
+          <w:p>
+            <w:pPr>
+              <w:pStyle w:val="Compact"/>
+            </w:pPr>
+            <w:r>
+              <w:rPr>
+                <w:sz w:val="19"/>
+              </w:rPr>
+              <w:t xml:space="preserve">Rutas simuladas dentro de </w:t>
+            </w:r>
+            <w:r>
+              <w:rPr>
+                <w:rStyle w:val="VerbatimChar"/>
+                <w:sz w:val="19"/>
+              </w:rPr>
+              <w:t>MemoryRouter</w:t>
+            </w:r>
+          </w:p>
+        </w:tc>
+        <w:tc>
+          <w:tcPr>
+            <w:tcW w:w="4762" w:type="dxa"/>
+          </w:tcPr>
+          <w:p>
+            <w:pPr>
+              <w:pStyle w:val="Compact"/>
+            </w:pPr>
+            <w:r>
+              <w:rPr>
+                <w:sz w:val="19"/>
+              </w:rPr>
+              <w:t>Comprueba a qué pantalla navega el pago (éxito o error) sin depender de las páginas reales</w:t>
+            </w:r>
+          </w:p>
+        </w:tc>
+      </w:tr>
     </w:tbl>
     <w:p>
       <w:pPr>
@@ -3750,6 +4941,7 @@
         <w:rPr>
           <w:color w:val="auto"/>
         </w:rPr>
+        <w:lastRenderedPageBreak/>
         <w:t>6. Resultados de la ejecución</w:t>
       </w:r>
     </w:p>
@@ -3764,7 +4956,7 @@
         <w:rPr>
           <w:rStyle w:val="VerbatimChar"/>
         </w:rPr>
-        <w:t>npm test</w:t>
+        <w:t xml:space="preserve">npm test</w:t>
       </w:r>
       <w:r>
         <w:t xml:space="preserve"> (</w:t>
@@ -3773,10 +4965,10 @@
         <w:rPr>
           <w:rStyle w:val="VerbatimChar"/>
         </w:rPr>
-        <w:t>karma start karma.conf.cjs --single-run</w:t>
-      </w:r>
-      <w:r>
-        <w:t>), en Chrome Headless 156.0.0.0 sobre Windows 10.</w:t>
+        <w:t xml:space="preserve">karma start karma.conf.cjs --single-run</w:t>
+      </w:r>
+      <w:r>
+        <w:t xml:space="preserve">), en Chrome Headless 156.0.0.0 sobre Windows 10.</w:t>
       </w:r>
     </w:p>
     <w:tbl>
@@ -3867,7 +5059,7 @@
               <w:rPr>
                 <w:sz w:val="19"/>
               </w:rPr>
-              <w:t>24 de 24</w:t>
+              <w:t>52 de 52</w:t>
             </w:r>
           </w:p>
         </w:tc>
@@ -3900,10 +5092,9 @@
             <w:r>
               <w:rPr>
                 <w:b/>
-                <w:bCs/>
-                <w:sz w:val="19"/>
-              </w:rPr>
-              <w:t>24 (100%)</w:t>
+                <w:sz w:val="19"/>
+              </w:rPr>
+              <w:t>52 (100%)</w:t>
             </w:r>
           </w:p>
         </w:tc>
@@ -3971,7 +5162,7 @@
               <w:rPr>
                 <w:sz w:val="19"/>
               </w:rPr>
-              <w:t>0,113 s</w:t>
+              <w:t>1,037 s</w:t>
             </w:r>
           </w:p>
         </w:tc>
@@ -3989,7 +5180,7 @@
               <w:rPr>
                 <w:sz w:val="19"/>
               </w:rPr>
-              <w:t>Compilación webpack</w:t>
+              <w:t xml:space="preserve">Compilación webpack</w:t>
             </w:r>
           </w:p>
         </w:tc>
@@ -4005,7 +5196,7 @@
               <w:rPr>
                 <w:sz w:val="19"/>
               </w:rPr>
-              <w:t>Exitosa (1811 ms)</w:t>
+              <w:t>Exitosa</w:t>
             </w:r>
           </w:p>
         </w:tc>
@@ -4025,7 +5216,7 @@
         <w:t>WARN</w:t>
       </w:r>
       <w:r>
-        <w:t>) de React Router sobre banderas futuras de la versión 7 (</w:t>
+        <w:t xml:space="preserve">) de React Router sobre banderas futuras de la versión 7 (</w:t>
       </w:r>
       <w:r>
         <w:rPr>
@@ -4193,7 +5384,7 @@
               <w:rPr>
                 <w:sz w:val="19"/>
               </w:rPr>
-              <w:t>103 / 108</w:t>
+              <w:t>199 / 199</w:t>
             </w:r>
           </w:p>
         </w:tc>
@@ -4209,7 +5400,7 @@
               <w:rPr>
                 <w:sz w:val="19"/>
               </w:rPr>
-              <w:t>95,37%</w:t>
+              <w:t>100%</w:t>
             </w:r>
           </w:p>
         </w:tc>
@@ -4227,7 +5418,6 @@
               <w:rPr>
                 <w:sz w:val="19"/>
               </w:rPr>
-              <w:lastRenderedPageBreak/>
               <w:t>Branches</w:t>
             </w:r>
           </w:p>
@@ -4244,7 +5434,7 @@
               <w:rPr>
                 <w:sz w:val="19"/>
               </w:rPr>
-              <w:t>57 / 60</w:t>
+              <w:t>95 / 98</w:t>
             </w:r>
           </w:p>
         </w:tc>
@@ -4260,7 +5450,7 @@
               <w:rPr>
                 <w:sz w:val="19"/>
               </w:rPr>
-              <w:t>95,00%</w:t>
+              <w:t>96,93%</w:t>
             </w:r>
           </w:p>
         </w:tc>
@@ -4294,7 +5484,7 @@
               <w:rPr>
                 <w:sz w:val="19"/>
               </w:rPr>
-              <w:t>39 / 42</w:t>
+              <w:t>75 / 75</w:t>
             </w:r>
           </w:p>
         </w:tc>
@@ -4310,7 +5500,7 @@
               <w:rPr>
                 <w:sz w:val="19"/>
               </w:rPr>
-              <w:t>92,85%</w:t>
+              <w:t>100%</w:t>
             </w:r>
           </w:p>
         </w:tc>
@@ -4344,7 +5534,7 @@
               <w:rPr>
                 <w:sz w:val="19"/>
               </w:rPr>
-              <w:t>89 / 92</w:t>
+              <w:t>177 / 177</w:t>
             </w:r>
           </w:p>
         </w:tc>
@@ -4360,7 +5550,7 @@
               <w:rPr>
                 <w:sz w:val="19"/>
               </w:rPr>
-              <w:t>96,73%</w:t>
+              <w:t>100%</w:t>
             </w:r>
           </w:p>
         </w:tc>
@@ -4441,7 +5631,7 @@
               <w:rPr>
                 <w:sz w:val="19"/>
               </w:rPr>
-              <w:t>% Stmts</w:t>
+              <w:t xml:space="preserve">% Stmts</w:t>
             </w:r>
           </w:p>
         </w:tc>
@@ -4477,7 +5667,7 @@
               <w:rPr>
                 <w:sz w:val="19"/>
               </w:rPr>
-              <w:t>% Funcs</w:t>
+              <w:t xml:space="preserve">% Funcs</w:t>
             </w:r>
           </w:p>
         </w:tc>
@@ -4653,7 +5843,7 @@
               <w:rPr>
                 <w:sz w:val="19"/>
               </w:rPr>
-              <w:t>88,88</w:t>
+              <w:t>100</w:t>
             </w:r>
           </w:p>
         </w:tc>
@@ -4687,7 +5877,7 @@
               <w:rPr>
                 <w:sz w:val="19"/>
               </w:rPr>
-              <w:t>86,66</w:t>
+              <w:t>100</w:t>
             </w:r>
           </w:p>
         </w:tc>
@@ -4704,7 +5894,7 @@
               <w:rPr>
                 <w:sz w:val="19"/>
               </w:rPr>
-              <w:t>91,30</w:t>
+              <w:t>100</w:t>
             </w:r>
           </w:p>
         </w:tc>
@@ -4721,7 +5911,7 @@
               <w:rPr>
                 <w:sz w:val="19"/>
               </w:rPr>
-              <w:t>9, 40</w:t>
+              <w:t>29-36 (ramas)</w:t>
             </w:r>
           </w:p>
         </w:tc>
@@ -4740,7 +5930,7 @@
                 <w:rStyle w:val="VerbatimChar"/>
                 <w:sz w:val="19"/>
               </w:rPr>
-              <w:t>context/ProductosContext.jsx</w:t>
+              <w:t>context/OrdenesContext.jsx</w:t>
             </w:r>
           </w:p>
         </w:tc>
@@ -4757,7 +5947,7 @@
               <w:rPr>
                 <w:sz w:val="19"/>
               </w:rPr>
-              <w:t>93,10</w:t>
+              <w:t>100</w:t>
             </w:r>
           </w:p>
         </w:tc>
@@ -4774,7 +5964,7 @@
               <w:rPr>
                 <w:sz w:val="19"/>
               </w:rPr>
-              <w:t>87,50</w:t>
+              <w:t>100</w:t>
             </w:r>
           </w:p>
         </w:tc>
@@ -4791,7 +5981,7 @@
               <w:rPr>
                 <w:sz w:val="19"/>
               </w:rPr>
-              <w:t>90,90</w:t>
+              <w:t>100</w:t>
             </w:r>
           </w:p>
         </w:tc>
@@ -4808,7 +5998,7 @@
               <w:rPr>
                 <w:sz w:val="19"/>
               </w:rPr>
-              <w:t>95,83</w:t>
+              <w:t>100</w:t>
             </w:r>
           </w:p>
         </w:tc>
@@ -4825,7 +6015,7 @@
               <w:rPr>
                 <w:sz w:val="19"/>
               </w:rPr>
-              <w:t>10</w:t>
+              <w:t>–</w:t>
             </w:r>
           </w:p>
         </w:tc>
@@ -4844,7 +6034,7 @@
                 <w:rStyle w:val="VerbatimChar"/>
                 <w:sz w:val="19"/>
               </w:rPr>
-              <w:t>pages/Productos.jsx</w:t>
+              <w:t>context/ProductosContext.jsx</w:t>
             </w:r>
           </w:p>
         </w:tc>
@@ -4878,6 +6068,23 @@
               <w:rPr>
                 <w:sz w:val="19"/>
               </w:rPr>
+              <w:t>96,15</w:t>
+            </w:r>
+          </w:p>
+        </w:tc>
+        <w:tc>
+          <w:tcPr>
+            <w:tcW w:w="1020" w:type="dxa"/>
+          </w:tcPr>
+          <w:p>
+            <w:pPr>
+              <w:pStyle w:val="Compact"/>
+              <w:jc w:val="center"/>
+            </w:pPr>
+            <w:r>
+              <w:rPr>
+                <w:sz w:val="19"/>
+              </w:rPr>
               <w:t>100</w:t>
             </w:r>
           </w:p>
@@ -4901,7 +6108,7 @@
         </w:tc>
         <w:tc>
           <w:tcPr>
-            <w:tcW w:w="1020" w:type="dxa"/>
+            <w:tcW w:w="2721" w:type="dxa"/>
           </w:tcPr>
           <w:p>
             <w:pPr>
@@ -4912,24 +6119,7 @@
               <w:rPr>
                 <w:sz w:val="19"/>
               </w:rPr>
-              <w:t>100</w:t>
-            </w:r>
-          </w:p>
-        </w:tc>
-        <w:tc>
-          <w:tcPr>
-            <w:tcW w:w="2721" w:type="dxa"/>
-          </w:tcPr>
-          <w:p>
-            <w:pPr>
-              <w:pStyle w:val="Compact"/>
-              <w:jc w:val="center"/>
-            </w:pPr>
-            <w:r>
-              <w:rPr>
-                <w:sz w:val="19"/>
-              </w:rPr>
-              <w:t>–</w:t>
+              <w:t>46 (rama)</w:t>
             </w:r>
           </w:p>
         </w:tc>
@@ -4948,7 +6138,7 @@
                 <w:rStyle w:val="VerbatimChar"/>
                 <w:sz w:val="19"/>
               </w:rPr>
-              <w:t>pages/RegistrarProducto.jsx</w:t>
+              <w:t>data/categorias.js</w:t>
             </w:r>
           </w:p>
         </w:tc>
@@ -5052,7 +6242,7 @@
                 <w:rStyle w:val="VerbatimChar"/>
                 <w:sz w:val="19"/>
               </w:rPr>
-              <w:t>services/productosService.js</w:t>
+              <w:t>data/zonas.js</w:t>
             </w:r>
           </w:p>
         </w:tc>
@@ -5156,6 +6346,422 @@
                 <w:rStyle w:val="VerbatimChar"/>
                 <w:sz w:val="19"/>
               </w:rPr>
+              <w:t>pages/Checkout.jsx</w:t>
+            </w:r>
+          </w:p>
+        </w:tc>
+        <w:tc>
+          <w:tcPr>
+            <w:tcW w:w="1020" w:type="dxa"/>
+          </w:tcPr>
+          <w:p>
+            <w:pPr>
+              <w:pStyle w:val="Compact"/>
+              <w:jc w:val="center"/>
+            </w:pPr>
+            <w:r>
+              <w:rPr>
+                <w:sz w:val="19"/>
+              </w:rPr>
+              <w:t>100</w:t>
+            </w:r>
+          </w:p>
+        </w:tc>
+        <w:tc>
+          <w:tcPr>
+            <w:tcW w:w="1020" w:type="dxa"/>
+          </w:tcPr>
+          <w:p>
+            <w:pPr>
+              <w:pStyle w:val="Compact"/>
+              <w:jc w:val="center"/>
+            </w:pPr>
+            <w:r>
+              <w:rPr>
+                <w:sz w:val="19"/>
+              </w:rPr>
+              <w:t>100</w:t>
+            </w:r>
+          </w:p>
+        </w:tc>
+        <w:tc>
+          <w:tcPr>
+            <w:tcW w:w="1020" w:type="dxa"/>
+          </w:tcPr>
+          <w:p>
+            <w:pPr>
+              <w:pStyle w:val="Compact"/>
+              <w:jc w:val="center"/>
+            </w:pPr>
+            <w:r>
+              <w:rPr>
+                <w:sz w:val="19"/>
+              </w:rPr>
+              <w:t>100</w:t>
+            </w:r>
+          </w:p>
+        </w:tc>
+        <w:tc>
+          <w:tcPr>
+            <w:tcW w:w="1020" w:type="dxa"/>
+          </w:tcPr>
+          <w:p>
+            <w:pPr>
+              <w:pStyle w:val="Compact"/>
+              <w:jc w:val="center"/>
+            </w:pPr>
+            <w:r>
+              <w:rPr>
+                <w:sz w:val="19"/>
+              </w:rPr>
+              <w:t>100</w:t>
+            </w:r>
+          </w:p>
+        </w:tc>
+        <w:tc>
+          <w:tcPr>
+            <w:tcW w:w="2721" w:type="dxa"/>
+          </w:tcPr>
+          <w:p>
+            <w:pPr>
+              <w:pStyle w:val="Compact"/>
+              <w:jc w:val="center"/>
+            </w:pPr>
+            <w:r>
+              <w:rPr>
+                <w:sz w:val="19"/>
+              </w:rPr>
+              <w:t>–</w:t>
+            </w:r>
+          </w:p>
+        </w:tc>
+      </w:tr>
+      <w:tr>
+        <w:tc>
+          <w:tcPr>
+            <w:tcW w:w="2608" w:type="dxa"/>
+          </w:tcPr>
+          <w:p>
+            <w:pPr>
+              <w:pStyle w:val="Compact"/>
+            </w:pPr>
+            <w:r>
+              <w:rPr>
+                <w:rStyle w:val="VerbatimChar"/>
+                <w:sz w:val="19"/>
+              </w:rPr>
+              <w:t>pages/Productos.jsx</w:t>
+            </w:r>
+          </w:p>
+        </w:tc>
+        <w:tc>
+          <w:tcPr>
+            <w:tcW w:w="1020" w:type="dxa"/>
+          </w:tcPr>
+          <w:p>
+            <w:pPr>
+              <w:pStyle w:val="Compact"/>
+              <w:jc w:val="center"/>
+            </w:pPr>
+            <w:r>
+              <w:rPr>
+                <w:sz w:val="19"/>
+              </w:rPr>
+              <w:t>100</w:t>
+            </w:r>
+          </w:p>
+        </w:tc>
+        <w:tc>
+          <w:tcPr>
+            <w:tcW w:w="1020" w:type="dxa"/>
+          </w:tcPr>
+          <w:p>
+            <w:pPr>
+              <w:pStyle w:val="Compact"/>
+              <w:jc w:val="center"/>
+            </w:pPr>
+            <w:r>
+              <w:rPr>
+                <w:sz w:val="19"/>
+              </w:rPr>
+              <w:t>100</w:t>
+            </w:r>
+          </w:p>
+        </w:tc>
+        <w:tc>
+          <w:tcPr>
+            <w:tcW w:w="1020" w:type="dxa"/>
+          </w:tcPr>
+          <w:p>
+            <w:pPr>
+              <w:pStyle w:val="Compact"/>
+              <w:jc w:val="center"/>
+            </w:pPr>
+            <w:r>
+              <w:rPr>
+                <w:sz w:val="19"/>
+              </w:rPr>
+              <w:t>100</w:t>
+            </w:r>
+          </w:p>
+        </w:tc>
+        <w:tc>
+          <w:tcPr>
+            <w:tcW w:w="1020" w:type="dxa"/>
+          </w:tcPr>
+          <w:p>
+            <w:pPr>
+              <w:pStyle w:val="Compact"/>
+              <w:jc w:val="center"/>
+            </w:pPr>
+            <w:r>
+              <w:rPr>
+                <w:sz w:val="19"/>
+              </w:rPr>
+              <w:t>100</w:t>
+            </w:r>
+          </w:p>
+        </w:tc>
+        <w:tc>
+          <w:tcPr>
+            <w:tcW w:w="2721" w:type="dxa"/>
+          </w:tcPr>
+          <w:p>
+            <w:pPr>
+              <w:pStyle w:val="Compact"/>
+              <w:jc w:val="center"/>
+            </w:pPr>
+            <w:r>
+              <w:rPr>
+                <w:sz w:val="19"/>
+              </w:rPr>
+              <w:t>–</w:t>
+            </w:r>
+          </w:p>
+        </w:tc>
+      </w:tr>
+      <w:tr>
+        <w:tc>
+          <w:tcPr>
+            <w:tcW w:w="2608" w:type="dxa"/>
+          </w:tcPr>
+          <w:p>
+            <w:pPr>
+              <w:pStyle w:val="Compact"/>
+            </w:pPr>
+            <w:r>
+              <w:rPr>
+                <w:rStyle w:val="VerbatimChar"/>
+                <w:sz w:val="19"/>
+              </w:rPr>
+              <w:t>pages/RegistrarProducto.jsx</w:t>
+            </w:r>
+          </w:p>
+        </w:tc>
+        <w:tc>
+          <w:tcPr>
+            <w:tcW w:w="1020" w:type="dxa"/>
+          </w:tcPr>
+          <w:p>
+            <w:pPr>
+              <w:pStyle w:val="Compact"/>
+              <w:jc w:val="center"/>
+            </w:pPr>
+            <w:r>
+              <w:rPr>
+                <w:sz w:val="19"/>
+              </w:rPr>
+              <w:t>100</w:t>
+            </w:r>
+          </w:p>
+        </w:tc>
+        <w:tc>
+          <w:tcPr>
+            <w:tcW w:w="1020" w:type="dxa"/>
+          </w:tcPr>
+          <w:p>
+            <w:pPr>
+              <w:pStyle w:val="Compact"/>
+              <w:jc w:val="center"/>
+            </w:pPr>
+            <w:r>
+              <w:rPr>
+                <w:sz w:val="19"/>
+              </w:rPr>
+              <w:t>100</w:t>
+            </w:r>
+          </w:p>
+        </w:tc>
+        <w:tc>
+          <w:tcPr>
+            <w:tcW w:w="1020" w:type="dxa"/>
+          </w:tcPr>
+          <w:p>
+            <w:pPr>
+              <w:pStyle w:val="Compact"/>
+              <w:jc w:val="center"/>
+            </w:pPr>
+            <w:r>
+              <w:rPr>
+                <w:sz w:val="19"/>
+              </w:rPr>
+              <w:t>100</w:t>
+            </w:r>
+          </w:p>
+        </w:tc>
+        <w:tc>
+          <w:tcPr>
+            <w:tcW w:w="1020" w:type="dxa"/>
+          </w:tcPr>
+          <w:p>
+            <w:pPr>
+              <w:pStyle w:val="Compact"/>
+              <w:jc w:val="center"/>
+            </w:pPr>
+            <w:r>
+              <w:rPr>
+                <w:sz w:val="19"/>
+              </w:rPr>
+              <w:t>100</w:t>
+            </w:r>
+          </w:p>
+        </w:tc>
+        <w:tc>
+          <w:tcPr>
+            <w:tcW w:w="2721" w:type="dxa"/>
+          </w:tcPr>
+          <w:p>
+            <w:pPr>
+              <w:pStyle w:val="Compact"/>
+              <w:jc w:val="center"/>
+            </w:pPr>
+            <w:r>
+              <w:rPr>
+                <w:sz w:val="19"/>
+              </w:rPr>
+              <w:t>–</w:t>
+            </w:r>
+          </w:p>
+        </w:tc>
+      </w:tr>
+      <w:tr>
+        <w:tc>
+          <w:tcPr>
+            <w:tcW w:w="2608" w:type="dxa"/>
+          </w:tcPr>
+          <w:p>
+            <w:pPr>
+              <w:pStyle w:val="Compact"/>
+            </w:pPr>
+            <w:r>
+              <w:rPr>
+                <w:rStyle w:val="VerbatimChar"/>
+                <w:sz w:val="19"/>
+              </w:rPr>
+              <w:t>services/productosService.js</w:t>
+            </w:r>
+          </w:p>
+        </w:tc>
+        <w:tc>
+          <w:tcPr>
+            <w:tcW w:w="1020" w:type="dxa"/>
+          </w:tcPr>
+          <w:p>
+            <w:pPr>
+              <w:pStyle w:val="Compact"/>
+              <w:jc w:val="center"/>
+            </w:pPr>
+            <w:r>
+              <w:rPr>
+                <w:sz w:val="19"/>
+              </w:rPr>
+              <w:t>100</w:t>
+            </w:r>
+          </w:p>
+        </w:tc>
+        <w:tc>
+          <w:tcPr>
+            <w:tcW w:w="1020" w:type="dxa"/>
+          </w:tcPr>
+          <w:p>
+            <w:pPr>
+              <w:pStyle w:val="Compact"/>
+              <w:jc w:val="center"/>
+            </w:pPr>
+            <w:r>
+              <w:rPr>
+                <w:sz w:val="19"/>
+              </w:rPr>
+              <w:t>100</w:t>
+            </w:r>
+          </w:p>
+        </w:tc>
+        <w:tc>
+          <w:tcPr>
+            <w:tcW w:w="1020" w:type="dxa"/>
+          </w:tcPr>
+          <w:p>
+            <w:pPr>
+              <w:pStyle w:val="Compact"/>
+              <w:jc w:val="center"/>
+            </w:pPr>
+            <w:r>
+              <w:rPr>
+                <w:sz w:val="19"/>
+              </w:rPr>
+              <w:t>100</w:t>
+            </w:r>
+          </w:p>
+        </w:tc>
+        <w:tc>
+          <w:tcPr>
+            <w:tcW w:w="1020" w:type="dxa"/>
+          </w:tcPr>
+          <w:p>
+            <w:pPr>
+              <w:pStyle w:val="Compact"/>
+              <w:jc w:val="center"/>
+            </w:pPr>
+            <w:r>
+              <w:rPr>
+                <w:sz w:val="19"/>
+              </w:rPr>
+              <w:t>100</w:t>
+            </w:r>
+          </w:p>
+        </w:tc>
+        <w:tc>
+          <w:tcPr>
+            <w:tcW w:w="2721" w:type="dxa"/>
+          </w:tcPr>
+          <w:p>
+            <w:pPr>
+              <w:pStyle w:val="Compact"/>
+              <w:jc w:val="center"/>
+            </w:pPr>
+            <w:r>
+              <w:rPr>
+                <w:sz w:val="19"/>
+              </w:rPr>
+              <w:t>–</w:t>
+            </w:r>
+          </w:p>
+        </w:tc>
+      </w:tr>
+      <w:tr>
+        <w:tc>
+          <w:tcPr>
+            <w:tcW w:w="2608" w:type="dxa"/>
+          </w:tcPr>
+          <w:p>
+            <w:pPr>
+              <w:pStyle w:val="Compact"/>
+            </w:pPr>
+            <w:r>
+              <w:rPr>
+                <w:rStyle w:val="VerbatimChar"/>
+                <w:sz w:val="19"/>
+              </w:rPr>
               <w:t>utils/validaciones.js</w:t>
             </w:r>
           </w:p>
@@ -5260,6 +6866,7 @@
         <w:rPr>
           <w:color w:val="auto"/>
         </w:rPr>
+        <w:lastRenderedPageBreak/>
         <w:t>7.3 Análisis de resultados</w:t>
       </w:r>
     </w:p>
@@ -5268,34 +6875,79 @@
         <w:pStyle w:val="FirstParagraph"/>
       </w:pPr>
       <w:r>
-        <w:t xml:space="preserve">Cinco de los siete módulos instrumentados alcanzan el 100% en todas las métricas, incluidos el componente </w:t>
-      </w:r>
-      <w:r>
-        <w:rPr>
-          <w:rStyle w:val="VerbatimChar"/>
-        </w:rPr>
-        <w:t>ProductCard</w:t>
-      </w:r>
-      <w:r>
-        <w:t xml:space="preserve">, las páginas </w:t>
-      </w:r>
-      <w:r>
-        <w:rPr>
-          <w:rStyle w:val="VerbatimChar"/>
-        </w:rPr>
-        <w:t>Productos</w:t>
-      </w:r>
-      <w:r>
-        <w:t xml:space="preserve"> y </w:t>
-      </w:r>
-      <w:r>
-        <w:rPr>
-          <w:rStyle w:val="VerbatimChar"/>
-        </w:rPr>
-        <w:t>RegistrarProducto</w:t>
-      </w:r>
-      <w:r>
-        <w:t>, el servicio de carga y las validaciones. Los dos archivos de contexto superan el 83% en todas las métricas. Las partes sin cubrir son:</w:t>
+        <w:t xml:space="preserve">Los 11 módulos instrumentados alcanzan 100% en statements, functions y lines, y 96,93% en branches. Solo quedan ramas (branches) sin cubrir en dos contextos: </w:t>
+      </w:r>
+      <w:r>
+        <w:rPr>
+          <w:rStyle w:val="VerbatimChar"/>
+        </w:rPr>
+        <w:t xml:space="preserve">CarritoContext</w:t>
+      </w:r>
+      <w:r>
+        <w:t xml:space="preserve"> (83,33%) y </w:t>
+      </w:r>
+      <w:r>
+        <w:rPr>
+          <w:rStyle w:val="VerbatimChar"/>
+        </w:rPr>
+        <w:t xml:space="preserve">ProductosContext</w:t>
+      </w:r>
+      <w:r>
+        <w:t xml:space="preserve"> (96,15%). Cabe destacar que, al ampliar el frontend con el CRUD de productos y el flujo de compra, la cobertura había bajado de 95,37% a 76,1% con las mismas 24 pruebas: </w:t>
+      </w:r>
+      <w:r>
+        <w:rPr>
+          <w:rStyle w:val="VerbatimChar"/>
+        </w:rPr>
+        <w:t xml:space="preserve">ProductosContext</w:t>
+      </w:r>
+      <w:r>
+        <w:t xml:space="preserve"> pasó de 93,10% a 52,70% de statements porque incorporó </w:t>
+      </w:r>
+      <w:r>
+        <w:rPr>
+          <w:rStyle w:val="VerbatimChar"/>
+        </w:rPr>
+        <w:t xml:space="preserve">editarProducto</w:t>
+      </w:r>
+      <w:r>
+        <w:t xml:space="preserve">, </w:t>
+      </w:r>
+      <w:r>
+        <w:rPr>
+          <w:rStyle w:val="VerbatimChar"/>
+        </w:rPr>
+        <w:t xml:space="preserve">eliminarProducto</w:t>
+      </w:r>
+      <w:r>
+        <w:t xml:space="preserve">, </w:t>
+      </w:r>
+      <w:r>
+        <w:rPr>
+          <w:rStyle w:val="VerbatimChar"/>
+        </w:rPr>
+        <w:t xml:space="preserve">descontarStock</w:t>
+      </w:r>
+      <w:r>
+        <w:t xml:space="preserve"> y la lectura de productos editados y eliminados sin pruebas asociadas. Al agregar 24 pruebas nuevas (de 24 a 48) se recuperó la cobertura de esos módulos. Después, al aparecer </w:t>
+      </w:r>
+      <w:r>
+        <w:rPr>
+          <w:rStyle w:val="VerbatimChar"/>
+        </w:rPr>
+        <w:t xml:space="preserve">OrdenesContext</w:t>
+      </w:r>
+      <w:r>
+        <w:t xml:space="preserve"> en el reporte con 73,33% de statements y 62,5% de functions, se agregó </w:t>
+      </w:r>
+      <w:r>
+        <w:rPr>
+          <w:rStyle w:val="VerbatimChar"/>
+        </w:rPr>
+        <w:t xml:space="preserve">OrdenesContext.spec.jsx</w:t>
+      </w:r>
+      <w:r>
+        <w:t xml:space="preserve"> (4 pruebas, 52 en total), que lo llevó al 100% en statements, branches, functions y lines. Las ramas que aún quedan sin cubrir son:</w:t>
       </w:r>
     </w:p>
     <w:tbl>
@@ -5425,7 +7077,7 @@
               <w:rPr>
                 <w:sz w:val="19"/>
               </w:rPr>
-              <w:t>9</w:t>
+              <w:t>29 y 36</w:t>
             </w:r>
           </w:p>
         </w:tc>
@@ -5441,14 +7093,27 @@
               <w:rPr>
                 <w:sz w:val="19"/>
               </w:rPr>
-              <w:t xml:space="preserve">Bloque </w:t>
+              <w:t xml:space="preserve">Rama </w:t>
             </w:r>
             <w:r>
               <w:rPr>
                 <w:rStyle w:val="VerbatimChar"/>
                 <w:sz w:val="19"/>
               </w:rPr>
-              <w:t>catch</w:t>
+              <w:t>else</w:t>
+            </w:r>
+            <w:r>
+              <w:rPr>
+                <w:sz w:val="19"/>
+              </w:rPr>
+              <w:t xml:space="preserve"> del ternario dentro de los </w:t>
+            </w:r>
+            <w:r>
+              <w:rPr>
+                <w:rStyle w:val="VerbatimChar"/>
+                <w:sz w:val="19"/>
+              </w:rPr>
+              <w:t>map</w:t>
             </w:r>
             <w:r>
               <w:rPr>
@@ -5461,7 +7126,20 @@
                 <w:rStyle w:val="VerbatimChar"/>
                 <w:sz w:val="19"/>
               </w:rPr>
-              <w:t>leerCarrito</w:t>
+              <w:t>agregar</w:t>
+            </w:r>
+            <w:r>
+              <w:rPr>
+                <w:sz w:val="19"/>
+              </w:rPr>
+              <w:t xml:space="preserve"> y </w:t>
+            </w:r>
+            <w:r>
+              <w:rPr>
+                <w:rStyle w:val="VerbatimChar"/>
+                <w:sz w:val="19"/>
+              </w:rPr>
+              <w:t>cambiarCantidad</w:t>
             </w:r>
           </w:p>
         </w:tc>
@@ -5477,14 +7155,7 @@
               <w:rPr>
                 <w:sz w:val="19"/>
               </w:rPr>
-              <w:t xml:space="preserve">Ninguna prueba guarda un JSON corrupto en </w:t>
-            </w:r>
-            <w:r>
-              <w:rPr>
-                <w:rStyle w:val="VerbatimChar"/>
-                <w:sz w:val="19"/>
-              </w:rPr>
-              <w:t>localStorage</w:t>
+              <w:t>Ninguna prueba opera sobre un producto teniendo otro producto distinto en el carrito</w:t>
             </w:r>
           </w:p>
         </w:tc>
@@ -5503,7 +7174,7 @@
                 <w:rStyle w:val="VerbatimChar"/>
                 <w:sz w:val="19"/>
               </w:rPr>
-              <w:t>CarritoContext.jsx</w:t>
+              <w:t>ProductosContext.jsx</w:t>
             </w:r>
           </w:p>
         </w:tc>
@@ -5520,7 +7191,7 @@
               <w:rPr>
                 <w:sz w:val="19"/>
               </w:rPr>
-              <w:t>40</w:t>
+              <w:t>46</w:t>
             </w:r>
           </w:p>
         </w:tc>
@@ -5536,14 +7207,46 @@
               <w:rPr>
                 <w:sz w:val="19"/>
               </w:rPr>
-              <w:t xml:space="preserve">Función </w:t>
+              <w:t xml:space="preserve">Rama </w:t>
             </w:r>
             <w:r>
               <w:rPr>
                 <w:rStyle w:val="VerbatimChar"/>
                 <w:sz w:val="19"/>
               </w:rPr>
-              <w:t>quitar(id)</w:t>
+              <w:t>else</w:t>
+            </w:r>
+            <w:r>
+              <w:rPr>
+                <w:sz w:val="19"/>
+              </w:rPr>
+              <w:t xml:space="preserve"> de </w:t>
+            </w:r>
+            <w:r>
+              <w:rPr>
+                <w:rStyle w:val="VerbatimChar"/>
+                <w:sz w:val="19"/>
+              </w:rPr>
+              <w:t xml:space="preserve">if (activo)</w:t>
+            </w:r>
+            <w:r>
+              <w:rPr>
+                <w:sz w:val="19"/>
+              </w:rPr>
+              <w:t xml:space="preserve"> dentro del </w:t>
+            </w:r>
+            <w:r>
+              <w:rPr>
+                <w:rStyle w:val="VerbatimChar"/>
+                <w:sz w:val="19"/>
+              </w:rPr>
+              <w:t>catch</w:t>
+            </w:r>
+            <w:r>
+              <w:rPr>
+                <w:sz w:val="19"/>
+              </w:rPr>
+              <w:t xml:space="preserve"> de la carga</w:t>
             </w:r>
           </w:p>
         </w:tc>
@@ -5559,128 +7262,7 @@
               <w:rPr>
                 <w:sz w:val="19"/>
               </w:rPr>
-              <w:t xml:space="preserve">Se probó </w:t>
-            </w:r>
-            <w:r>
-              <w:rPr>
-                <w:rStyle w:val="VerbatimChar"/>
-                <w:sz w:val="19"/>
-              </w:rPr>
-              <w:t>cambiarCantidad</w:t>
-            </w:r>
-            <w:r>
-              <w:rPr>
-                <w:sz w:val="19"/>
-              </w:rPr>
-              <w:t xml:space="preserve"> y </w:t>
-            </w:r>
-            <w:r>
-              <w:rPr>
-                <w:rStyle w:val="VerbatimChar"/>
-                <w:sz w:val="19"/>
-              </w:rPr>
-              <w:t>vaciar</w:t>
-            </w:r>
-            <w:r>
-              <w:rPr>
-                <w:sz w:val="19"/>
-              </w:rPr>
-              <w:t>, pero no la eliminación directa de un producto</w:t>
-            </w:r>
-          </w:p>
-        </w:tc>
-      </w:tr>
-      <w:tr>
-        <w:tc>
-          <w:tcPr>
-            <w:tcW w:w="2154" w:type="dxa"/>
-          </w:tcPr>
-          <w:p>
-            <w:pPr>
-              <w:pStyle w:val="Compact"/>
-            </w:pPr>
-            <w:r>
-              <w:rPr>
-                <w:rStyle w:val="VerbatimChar"/>
-                <w:sz w:val="19"/>
-              </w:rPr>
-              <w:t>ProductosContext.jsx</w:t>
-            </w:r>
-          </w:p>
-        </w:tc>
-        <w:tc>
-          <w:tcPr>
-            <w:tcW w:w="794" w:type="dxa"/>
-          </w:tcPr>
-          <w:p>
-            <w:pPr>
-              <w:pStyle w:val="Compact"/>
-              <w:jc w:val="center"/>
-            </w:pPr>
-            <w:r>
-              <w:rPr>
-                <w:sz w:val="19"/>
-              </w:rPr>
-              <w:t>10</w:t>
-            </w:r>
-          </w:p>
-        </w:tc>
-        <w:tc>
-          <w:tcPr>
-            <w:tcW w:w="2721" w:type="dxa"/>
-          </w:tcPr>
-          <w:p>
-            <w:pPr>
-              <w:pStyle w:val="Compact"/>
-            </w:pPr>
-            <w:r>
-              <w:rPr>
-                <w:sz w:val="19"/>
-              </w:rPr>
-              <w:t xml:space="preserve">Bloque </w:t>
-            </w:r>
-            <w:r>
-              <w:rPr>
-                <w:rStyle w:val="VerbatimChar"/>
-                <w:sz w:val="19"/>
-              </w:rPr>
-              <w:t>catch</w:t>
-            </w:r>
-            <w:r>
-              <w:rPr>
-                <w:sz w:val="19"/>
-              </w:rPr>
-              <w:t xml:space="preserve"> de </w:t>
-            </w:r>
-            <w:r>
-              <w:rPr>
-                <w:rStyle w:val="VerbatimChar"/>
-                <w:sz w:val="19"/>
-              </w:rPr>
-              <w:t>leerExtras</w:t>
-            </w:r>
-          </w:p>
-        </w:tc>
-        <w:tc>
-          <w:tcPr>
-            <w:tcW w:w="3742" w:type="dxa"/>
-          </w:tcPr>
-          <w:p>
-            <w:pPr>
-              <w:pStyle w:val="Compact"/>
-            </w:pPr>
-            <w:r>
-              <w:rPr>
-                <w:sz w:val="19"/>
-              </w:rPr>
-              <w:t xml:space="preserve">Ninguna prueba guarda un JSON corrupto en </w:t>
-            </w:r>
-            <w:r>
-              <w:rPr>
-                <w:rStyle w:val="VerbatimChar"/>
-                <w:sz w:val="19"/>
-              </w:rPr>
-              <w:t>productosExtra</w:t>
+              <w:t xml:space="preserve">Ninguna prueba desmonta el provider antes de que falle la carga del catálogo</w:t>
             </w:r>
           </w:p>
         </w:tc>
@@ -5691,16 +7273,25 @@
         <w:pStyle w:val="Textoindependiente"/>
       </w:pPr>
       <w:r>
-        <w:t xml:space="preserve">Las ramas (branches) sin cubrir corresponden a esos mismos caminos de manejo de errores y a la función </w:t>
-      </w:r>
-      <w:r>
-        <w:rPr>
-          <w:rStyle w:val="VerbatimChar"/>
-        </w:rPr>
-        <w:t>quitar</w:t>
-      </w:r>
-      <w:r>
-        <w:t>.</w:t>
+        <w:t xml:space="preserve">Son tres ramas en total (dos en </w:t>
+      </w:r>
+      <w:r>
+        <w:rPr>
+          <w:rStyle w:val="VerbatimChar"/>
+        </w:rPr>
+        <w:t xml:space="preserve">CarritoContext</w:t>
+      </w:r>
+      <w:r>
+        <w:t xml:space="preserve"> y una en </w:t>
+      </w:r>
+      <w:r>
+        <w:rPr>
+          <w:rStyle w:val="VerbatimChar"/>
+        </w:rPr>
+        <w:t xml:space="preserve">ProductosContext</w:t>
+      </w:r>
+      <w:r>
+        <w:t xml:space="preserve">): caminos alternativos de bajo riesgo. No quedan sentencias, funciones ni líneas sin ejecutar.</w:t>
       </w:r>
     </w:p>
     <w:p>
@@ -5724,7 +7315,7 @@
         <w:pStyle w:val="FirstParagraph"/>
       </w:pPr>
       <w:r>
-        <w:t>Para llevar los contextos al 100% bastarían tres pruebas adicionales:</w:t>
+        <w:t xml:space="preserve">Para llevar las ramas al 100% bastarían dos pruebas adicionales:</w:t>
       </w:r>
     </w:p>
     <w:p>
@@ -5736,16 +7327,25 @@
         </w:numPr>
       </w:pPr>
       <w:r>
-        <w:t xml:space="preserve">Guardar un valor no JSON en </w:t>
-      </w:r>
-      <w:r>
-        <w:rPr>
-          <w:rStyle w:val="VerbatimChar"/>
-        </w:rPr>
-        <w:t>localStorage.carrito</w:t>
-      </w:r>
-      <w:r>
-        <w:t xml:space="preserve"> y verificar que el carrito inicia vacío.</w:t>
+        <w:t xml:space="preserve">Agregar al carrito dos productos distintos y luego volver a agregar el primero (y usar </w:t>
+      </w:r>
+      <w:r>
+        <w:rPr>
+          <w:rStyle w:val="VerbatimChar"/>
+        </w:rPr>
+        <w:t>cambiarCantidad</w:t>
+      </w:r>
+      <w:r>
+        <w:t xml:space="preserve"> con ambos presentes), para cubrir las ramas de los </w:t>
+      </w:r>
+      <w:r>
+        <w:rPr>
+          <w:rStyle w:val="VerbatimChar"/>
+        </w:rPr>
+        <w:t>map</w:t>
+      </w:r>
+      <w:r>
+        <w:t>.</w:t>
       </w:r>
     </w:p>
     <w:p>
@@ -5757,46 +7357,34 @@
         </w:numPr>
       </w:pPr>
       <w:r>
-        <w:t xml:space="preserve">Llamar a </w:t>
-      </w:r>
-      <w:r>
-        <w:rPr>
-          <w:rStyle w:val="VerbatimChar"/>
-        </w:rPr>
-        <w:t>quitar(id)</w:t>
-      </w:r>
-      <w:r>
-        <w:t xml:space="preserve"> y comprobar que el producto desaparece de </w:t>
-      </w:r>
-      <w:r>
-        <w:rPr>
-          <w:rStyle w:val="VerbatimChar"/>
-        </w:rPr>
-        <w:t>items</w:t>
+        <w:t xml:space="preserve">Desmontar el provider (</w:t>
+      </w:r>
+      <w:r>
+        <w:rPr>
+          <w:rStyle w:val="VerbatimChar"/>
+        </w:rPr>
+        <w:t>unmount</w:t>
+      </w:r>
+      <w:r>
+        <w:t xml:space="preserve">) antes de que termine la carga del catálogo, para cubrir la rama </w:t>
+      </w:r>
+      <w:r>
+        <w:rPr>
+          <w:rStyle w:val="VerbatimChar"/>
+        </w:rPr>
+        <w:t xml:space="preserve">if (activo)</w:t>
+      </w:r>
+      <w:r>
+        <w:t xml:space="preserve"> del </w:t>
+      </w:r>
+      <w:r>
+        <w:rPr>
+          <w:rStyle w:val="VerbatimChar"/>
+        </w:rPr>
+        <w:t>catch</w:t>
       </w:r>
       <w:r>
         <w:t>.</w:t>
-      </w:r>
-    </w:p>
-    <w:p>
-      <w:pPr>
-        <w:pStyle w:val="Compact"/>
-        <w:numPr>
-          <w:ilvl w:val="0"/>
-          <w:numId w:val="7"/>
-        </w:numPr>
-      </w:pPr>
-      <w:r>
-        <w:t xml:space="preserve">Guardar un valor no JSON en </w:t>
-      </w:r>
-      <w:r>
-        <w:rPr>
-          <w:rStyle w:val="VerbatimChar"/>
-        </w:rPr>
-        <w:t>localStorage.productosExtra</w:t>
-      </w:r>
-      <w:r>
-        <w:t xml:space="preserve"> y verificar que no se agregan productos extra.</w:t>
       </w:r>
     </w:p>
     <w:p>
@@ -5813,7 +7401,6 @@
         <w:rPr>
           <w:color w:val="auto"/>
         </w:rPr>
-        <w:lastRenderedPageBreak/>
         <w:t>8. Alcance y limitaciones</w:t>
       </w:r>
     </w:p>
@@ -5822,17 +7409,16 @@
         <w:pStyle w:val="FirstParagraph"/>
       </w:pPr>
       <w:r>
-        <w:t xml:space="preserve">La cobertura del 95,37% se calcula sobre los siete módulos que las pruebas cargan e instrumentan. Los siguientes archivos del proyecto no son importados por ninguna prueba, por lo que </w:t>
+        <w:t xml:space="preserve">Los porcentajes de cobertura se calculan sobre los 11 módulos que las pruebas cargan e instrumentan. Los siguientes archivos del proyecto no son importados por ninguna prueba, por lo que </w:t>
       </w:r>
       <w:r>
         <w:rPr>
           <w:b/>
-          <w:bCs/>
-        </w:rPr>
-        <w:t>no aparecen en el reporte y no tienen pruebas unitarias</w:t>
-      </w:r>
-      <w:r>
-        <w:t>:</w:t>
+        </w:rPr>
+        <w:t xml:space="preserve">no aparecen en el reporte y no tienen pruebas unitarias</w:t>
+      </w:r>
+      <w:r>
+        <w:t xml:space="preserve">:</w:t>
       </w:r>
     </w:p>
     <w:p>
@@ -5844,25 +7430,115 @@
         </w:numPr>
       </w:pPr>
       <w:r>
-        <w:t xml:space="preserve">Páginas: </w:t>
-      </w:r>
-      <w:r>
-        <w:rPr>
-          <w:rStyle w:val="VerbatimChar"/>
-        </w:rPr>
-        <w:t>Carrito.jsx</w:t>
-      </w:r>
-      <w:r>
-        <w:t xml:space="preserve"> e </w:t>
-      </w:r>
-      <w:r>
-        <w:rPr>
-          <w:rStyle w:val="VerbatimChar"/>
-        </w:rPr>
-        <w:t>Inicio.jsx</w:t>
-      </w:r>
-      <w:r>
-        <w:t>.</w:t>
+        <w:t xml:space="preserve">Páginas (12 de 15): </w:t>
+      </w:r>
+      <w:r>
+        <w:rPr>
+          <w:rStyle w:val="VerbatimChar"/>
+        </w:rPr>
+        <w:t xml:space="preserve">Carrito.jsx</w:t>
+      </w:r>
+      <w:r>
+        <w:t xml:space="preserve">, </w:t>
+      </w:r>
+      <w:r>
+        <w:rPr>
+          <w:rStyle w:val="VerbatimChar"/>
+        </w:rPr>
+        <w:t xml:space="preserve">Inicio.jsx</w:t>
+      </w:r>
+      <w:r>
+        <w:t xml:space="preserve">, </w:t>
+      </w:r>
+      <w:r>
+        <w:rPr>
+          <w:rStyle w:val="VerbatimChar"/>
+        </w:rPr>
+        <w:t xml:space="preserve">Categorias.jsx</w:t>
+      </w:r>
+      <w:r>
+        <w:t xml:space="preserve">, </w:t>
+      </w:r>
+      <w:r>
+        <w:rPr>
+          <w:rStyle w:val="VerbatimChar"/>
+        </w:rPr>
+        <w:t xml:space="preserve">Ofertas.jsx</w:t>
+      </w:r>
+      <w:r>
+        <w:t xml:space="preserve">, </w:t>
+      </w:r>
+      <w:r>
+        <w:rPr>
+          <w:rStyle w:val="VerbatimChar"/>
+        </w:rPr>
+        <w:t xml:space="preserve">ProductoDetalle.jsx</w:t>
+      </w:r>
+      <w:r>
+        <w:t xml:space="preserve">, </w:t>
+      </w:r>
+      <w:r>
+        <w:rPr>
+          <w:rStyle w:val="VerbatimChar"/>
+        </w:rPr>
+        <w:t xml:space="preserve">AdministrarProductos.jsx</w:t>
+      </w:r>
+      <w:r>
+        <w:t xml:space="preserve">, </w:t>
+      </w:r>
+      <w:r>
+        <w:rPr>
+          <w:rStyle w:val="VerbatimChar"/>
+        </w:rPr>
+        <w:t xml:space="preserve">DetalleProducto.jsx</w:t>
+      </w:r>
+      <w:r>
+        <w:t xml:space="preserve">, </w:t>
+      </w:r>
+      <w:r>
+        <w:rPr>
+          <w:rStyle w:val="VerbatimChar"/>
+        </w:rPr>
+        <w:t xml:space="preserve">EditarProducto.jsx</w:t>
+      </w:r>
+      <w:r>
+        <w:t xml:space="preserve">, </w:t>
+      </w:r>
+      <w:r>
+        <w:rPr>
+          <w:rStyle w:val="VerbatimChar"/>
+        </w:rPr>
+        <w:t xml:space="preserve">AdministrarOrdenes.jsx</w:t>
+      </w:r>
+      <w:r>
+        <w:t xml:space="preserve">, </w:t>
+      </w:r>
+      <w:r>
+        <w:rPr>
+          <w:rStyle w:val="VerbatimChar"/>
+        </w:rPr>
+        <w:t xml:space="preserve">DetalleOrden.jsx</w:t>
+      </w:r>
+      <w:r>
+        <w:t xml:space="preserve">, </w:t>
+      </w:r>
+      <w:r>
+        <w:rPr>
+          <w:rStyle w:val="VerbatimChar"/>
+        </w:rPr>
+        <w:t xml:space="preserve">CompraError.jsx</w:t>
+      </w:r>
+      <w:r>
+        <w:t xml:space="preserve"> y </w:t>
+      </w:r>
+      <w:r>
+        <w:rPr>
+          <w:rStyle w:val="VerbatimChar"/>
+        </w:rPr>
+        <w:t xml:space="preserve">CompraExitosa.jsx</w:t>
+      </w:r>
+      <w:r>
+        <w:t xml:space="preserve">.</w:t>
       </w:r>
     </w:p>
     <w:p>
@@ -5930,34 +7606,43 @@
         <w:pStyle w:val="FirstParagraph"/>
       </w:pPr>
       <w:r>
-        <w:t xml:space="preserve">La lógica del carrito sí está cubierta a través de </w:t>
-      </w:r>
-      <w:r>
-        <w:rPr>
-          <w:rStyle w:val="VerbatimChar"/>
-        </w:rPr>
-        <w:t>CarritoContext</w:t>
-      </w:r>
-      <w:r>
-        <w:t xml:space="preserve">, pero la interfaz de la página </w:t>
-      </w:r>
-      <w:r>
-        <w:rPr>
-          <w:rStyle w:val="VerbatimChar"/>
-        </w:rPr>
-        <w:t>Carrito.jsx</w:t>
-      </w:r>
-      <w:r>
-        <w:t xml:space="preserve"> queda sin verificar. Como mejora futura se recomienda agregar pruebas para estos archivos o configurar Istanbul para incluir todos los archivos de </w:t>
-      </w:r>
-      <w:r>
-        <w:rPr>
-          <w:rStyle w:val="VerbatimChar"/>
-        </w:rPr>
-        <w:t>src</w:t>
-      </w:r>
-      <w:r>
-        <w:t>, de modo que el porcentaje refleje el proyecto completo.</w:t>
+        <w:t xml:space="preserve">La lógica del carrito, del catálogo (editar, eliminar y descontar stock) y de las órdenes sí está cubierta a través de </w:t>
+      </w:r>
+      <w:r>
+        <w:rPr>
+          <w:rStyle w:val="VerbatimChar"/>
+        </w:rPr>
+        <w:t xml:space="preserve">CarritoContext</w:t>
+      </w:r>
+      <w:r>
+        <w:t xml:space="preserve">, </w:t>
+      </w:r>
+      <w:r>
+        <w:rPr>
+          <w:rStyle w:val="VerbatimChar"/>
+        </w:rPr>
+        <w:t xml:space="preserve">ProductosContext</w:t>
+      </w:r>
+      <w:r>
+        <w:t xml:space="preserve"> y </w:t>
+      </w:r>
+      <w:r>
+        <w:rPr>
+          <w:rStyle w:val="VerbatimChar"/>
+        </w:rPr>
+        <w:t xml:space="preserve">OrdenesContext</w:t>
+      </w:r>
+      <w:r>
+        <w:t xml:space="preserve">, pero las interfaces de estas páginas quedan sin verificar. Como mejora futura se recomienda agregar pruebas para estos archivos o configurar Istanbul para incluir todos los archivos de </w:t>
+      </w:r>
+      <w:r>
+        <w:rPr>
+          <w:rStyle w:val="VerbatimChar"/>
+        </w:rPr>
+        <w:t xml:space="preserve">src</w:t>
+      </w:r>
+      <w:r>
+        <w:t xml:space="preserve">, de modo que el porcentaje refleje el proyecto completo.</w:t>
       </w:r>
     </w:p>
     <w:p>
@@ -5973,6 +7658,7 @@
         <w:rPr>
           <w:color w:val="auto"/>
         </w:rPr>
+        <w:lastRenderedPageBreak/>
         <w:t>9. Conclusiones</w:t>
       </w:r>
     </w:p>
@@ -6006,7 +7692,7 @@
         </w:numPr>
       </w:pPr>
       <w:r>
-        <w:t>Las 24 pruebas pasan en su totalidad y verifican lógica pura, estado global, props, estados de componentes, eventos y manipulación del DOM.</w:t>
+        <w:t xml:space="preserve">Las 52 pruebas pasan en su totalidad y verifican lógica pura, estado global (carrito, catálogo y órdenes), props, estados de componentes, eventos, flujo de compra y manipulación del DOM.</w:t>
       </w:r>
     </w:p>
     <w:p>
@@ -6018,7 +7704,7 @@
         </w:numPr>
       </w:pPr>
       <w:r>
-        <w:t>La cobertura de 95,37% en statements, 95% en branches, 92,85% en functions y 96,73% en lines indica que las funcionalidades principales (catálogo, carrito, formulario de registro, validaciones y carga de datos) están bien resguardadas.</w:t>
+        <w:t xml:space="preserve">La cobertura de 100% en statements, 96,93% en branches, 100% en functions y 100% en lines indica que las funcionalidades principales (catálogo y su CRUD, carrito, órdenes de compra, formulario de registro, checkout, validaciones y carga de datos) están bien resguardadas.</w:t>
       </w:r>
     </w:p>
     <w:p>
@@ -6030,25 +7716,46 @@
         </w:numPr>
       </w:pPr>
       <w:r>
-        <w:t xml:space="preserve">Las brechas identificadas son acotadas y de bajo riesgo (manejo de datos corruptos en </w:t>
-      </w:r>
-      <w:r>
-        <w:rPr>
-          <w:rStyle w:val="VerbatimChar"/>
-        </w:rPr>
-        <w:t>localStorage</w:t>
-      </w:r>
-      <w:r>
-        <w:t xml:space="preserve"> y la función </w:t>
-      </w:r>
-      <w:r>
-        <w:rPr>
-          <w:rStyle w:val="VerbatimChar"/>
-        </w:rPr>
-        <w:t>quitar</w:t>
-      </w:r>
-      <w:r>
-        <w:t>), y se resuelven con tres pruebas adicionales.</w:t>
+        <w:t xml:space="preserve">La cobertura bajó de 95,37% a 76,1% al incorporar nuevas funcionalidades sin pruebas y se recuperó agregando pruebas (de 24 a 52); el reporte de cobertura permitió detectar y priorizar el código sin verificar, incluido </w:t>
+      </w:r>
+      <w:r>
+        <w:rPr>
+          <w:rStyle w:val="VerbatimChar"/>
+        </w:rPr>
+        <w:t xml:space="preserve">OrdenesContext</w:t>
+      </w:r>
+      <w:r>
+        <w:t xml:space="preserve">, que partía en 73,33% y hoy está al 100%.</w:t>
+      </w:r>
+    </w:p>
+    <w:p>
+      <w:pPr>
+        <w:pStyle w:val="Compact"/>
+        <w:numPr>
+          <w:ilvl w:val="0"/>
+          <w:numId w:val="9"/>
+        </w:numPr>
+      </w:pPr>
+      <w:r>
+        <w:t xml:space="preserve">Las brechas identificadas son acotadas y de bajo riesgo: tres ramas alternativas (dos en </w:t>
+      </w:r>
+      <w:r>
+        <w:rPr>
+          <w:rStyle w:val="VerbatimChar"/>
+        </w:rPr>
+        <w:t xml:space="preserve">CarritoContext</w:t>
+      </w:r>
+      <w:r>
+        <w:t xml:space="preserve"> y una en </w:t>
+      </w:r>
+      <w:r>
+        <w:rPr>
+          <w:rStyle w:val="VerbatimChar"/>
+        </w:rPr>
+        <w:t xml:space="preserve">ProductosContext</w:t>
+      </w:r>
+      <w:r>
+        <w:t xml:space="preserve">) y las páginas y componentes que ninguna prueba importa (sección 8).</w:t>
       </w:r>
     </w:p>
     <w:p>
@@ -6078,10 +7785,10 @@
         <w:rPr>
           <w:rStyle w:val="VerbatimChar"/>
         </w:rPr>
-        <w:t>npm test</w:t>
-      </w:r>
-      <w:r>
-        <w:t xml:space="preserve"> el 28 de octubre de 2026: 24 de 24 pruebas exitosas y tabla de cobertura por archivo.</w:t>
+        <w:t xml:space="preserve">npm test</w:t>
+      </w:r>
+      <w:r>
+        <w:t xml:space="preserve"> el 29 de octubre de 2026: tabla de cobertura por archivo con las 52 pruebas exitosas.</w:t>
       </w:r>
     </w:p>
     <w:p>
@@ -6092,10 +7799,9 @@
         <w:rPr>
           <w:noProof/>
         </w:rPr>
-        <w:lastRenderedPageBreak/>
         <w:drawing>
           <wp:inline distT="0" distB="0" distL="0" distR="0" wp14:anchorId="5D9FAC4C" wp14:editId="51A1C5D0">
-            <wp:extent cx="5334000" cy="2875968"/>
+            <wp:extent cx="5334000" cy="3391728"/>
             <wp:effectExtent l="0" t="0" r="0" b="0"/>
             <wp:docPr id="45" name="Picture" descr="Ejecución de npm test: 24 de 24 SUCCESS y reporte de cobertura"/>
             <wp:cNvGraphicFramePr/>
@@ -6109,7 +7815,7 @@
                     </pic:cNvPicPr>
                   </pic:nvPicPr>
                   <pic:blipFill>
-                    <a:blip r:embed="rId15"/>
+                    <a:blip r:embed="rId18"/>
                     <a:stretch>
                       <a:fillRect/>
                     </a:stretch>
@@ -6117,7 +7823,7 @@
                   <pic:spPr bwMode="auto">
                     <a:xfrm>
                       <a:off x="0" y="0"/>
-                      <a:ext cx="5334000" cy="2875968"/>
+                      <a:ext cx="5334000" cy="3391728"/>
                     </a:xfrm>
                     <a:prstGeom prst="rect">
                       <a:avLst/>
@@ -6141,7 +7847,7 @@
         <w:pStyle w:val="ImageCaption"/>
       </w:pPr>
       <w:r>
-        <w:t>Ejecución de npm test: 24 de 24 SUCCESS y reporte de cobertura</w:t>
+        <w:t xml:space="preserve">Reporte de cobertura por archivo tras ejecutar npm test (52 de 52 SUCCESS)</w:t>
       </w:r>
     </w:p>
     <w:p>
@@ -6167,13 +7873,13 @@
       <w:r>
         <w:t xml:space="preserve">Repositorio GitHub: </w:t>
       </w:r>
-      <w:hyperlink r:id="rId16">
+      <w:hyperlink r:id="rId19">
         <w:r>
           <w:rPr>
             <w:rStyle w:val="Hipervnculo"/>
             <w:color w:val="auto"/>
           </w:rPr>
-          <w:t>https://github.com/CataSalinas/PerlitasdeEucarion-Frontend-Calvucura-Riveras-Salinas</w:t>
+          <w:t>https://github.com/CataSalinas/PerlitasdeEucarion-Frontend-Calvucura-Riveros-Salinas</w:t>
         </w:r>
       </w:hyperlink>
       <w:bookmarkEnd w:id="25"/>

</xml_diff>